<commit_message>
working on the patient
</commit_message>
<xml_diff>
--- a/New Microsoft Word Document.docx
+++ b/New Microsoft Word Document.docx
@@ -121,8 +121,13 @@
           </w:tcPr>
           <w:p>
             <w:r>
-              <w:t>staff, staff_auth</w:t>
-            </w:r>
+              <w:t xml:space="preserve">staff, </w:t>
+            </w:r>
+            <w:proofErr w:type="spellStart"/>
+            <w:r>
+              <w:t>staff_auth</w:t>
+            </w:r>
+            <w:proofErr w:type="spellEnd"/>
           </w:p>
         </w:tc>
       </w:tr>
@@ -208,7 +213,39 @@
           </w:tcPr>
           <w:p>
             <w:r>
-              <w:t>services, treatment_plans, patient_services, plan_services, conditions, condition_details, retreatments</w:t>
+              <w:t xml:space="preserve">services, </w:t>
+            </w:r>
+            <w:proofErr w:type="spellStart"/>
+            <w:r>
+              <w:t>treatment_plans</w:t>
+            </w:r>
+            <w:proofErr w:type="spellEnd"/>
+            <w:r>
+              <w:t xml:space="preserve">, </w:t>
+            </w:r>
+            <w:proofErr w:type="spellStart"/>
+            <w:r>
+              <w:t>patient_services</w:t>
+            </w:r>
+            <w:proofErr w:type="spellEnd"/>
+            <w:r>
+              <w:t xml:space="preserve">, </w:t>
+            </w:r>
+            <w:proofErr w:type="spellStart"/>
+            <w:r>
+              <w:t>plan_services</w:t>
+            </w:r>
+            <w:proofErr w:type="spellEnd"/>
+            <w:r>
+              <w:t xml:space="preserve">, conditions, </w:t>
+            </w:r>
+            <w:proofErr w:type="spellStart"/>
+            <w:r>
+              <w:t>condition_details</w:t>
+            </w:r>
+            <w:proofErr w:type="spellEnd"/>
+            <w:r>
+              <w:t>, retreatments</w:t>
             </w:r>
           </w:p>
         </w:tc>
@@ -237,8 +274,21 @@
           </w:tcPr>
           <w:p>
             <w:r>
-              <w:t>labs, lab_cases, lab_payments</w:t>
-            </w:r>
+              <w:t xml:space="preserve">labs, </w:t>
+            </w:r>
+            <w:proofErr w:type="spellStart"/>
+            <w:r>
+              <w:t>lab_cases</w:t>
+            </w:r>
+            <w:proofErr w:type="spellEnd"/>
+            <w:r>
+              <w:t xml:space="preserve">, </w:t>
+            </w:r>
+            <w:proofErr w:type="spellStart"/>
+            <w:r>
+              <w:t>lab_payments</w:t>
+            </w:r>
+            <w:proofErr w:type="spellEnd"/>
           </w:p>
         </w:tc>
       </w:tr>
@@ -265,9 +315,19 @@
             <w:hideMark/>
           </w:tcPr>
           <w:p>
-            <w:r>
-              <w:t>medicine_inventory, medicine_sales</w:t>
-            </w:r>
+            <w:proofErr w:type="spellStart"/>
+            <w:r>
+              <w:t>medicine_inventory</w:t>
+            </w:r>
+            <w:proofErr w:type="spellEnd"/>
+            <w:r>
+              <w:t xml:space="preserve">, </w:t>
+            </w:r>
+            <w:proofErr w:type="spellStart"/>
+            <w:r>
+              <w:t>medicine_sales</w:t>
+            </w:r>
+            <w:proofErr w:type="spellEnd"/>
           </w:p>
         </w:tc>
       </w:tr>
@@ -294,9 +354,19 @@
             <w:hideMark/>
           </w:tcPr>
           <w:p>
-            <w:r>
-              <w:t>supplies_inventory, supplies_sales</w:t>
-            </w:r>
+            <w:proofErr w:type="spellStart"/>
+            <w:r>
+              <w:t>supplies_inventory</w:t>
+            </w:r>
+            <w:proofErr w:type="spellEnd"/>
+            <w:r>
+              <w:t xml:space="preserve">, </w:t>
+            </w:r>
+            <w:proofErr w:type="spellStart"/>
+            <w:r>
+              <w:t>supplies_sales</w:t>
+            </w:r>
+            <w:proofErr w:type="spellEnd"/>
           </w:p>
         </w:tc>
       </w:tr>
@@ -324,8 +394,45 @@
           </w:tcPr>
           <w:p>
             <w:r>
-              <w:t>expenses, expense_detail, expense_invoices, fee_payments, taxes, tax_payments, class_revenues</w:t>
-            </w:r>
+              <w:t xml:space="preserve">expenses, </w:t>
+            </w:r>
+            <w:proofErr w:type="spellStart"/>
+            <w:r>
+              <w:t>expense_detail</w:t>
+            </w:r>
+            <w:proofErr w:type="spellEnd"/>
+            <w:r>
+              <w:t xml:space="preserve">, </w:t>
+            </w:r>
+            <w:proofErr w:type="spellStart"/>
+            <w:r>
+              <w:t>expense_invoices</w:t>
+            </w:r>
+            <w:proofErr w:type="spellEnd"/>
+            <w:r>
+              <w:t xml:space="preserve">, </w:t>
+            </w:r>
+            <w:proofErr w:type="spellStart"/>
+            <w:r>
+              <w:t>fee_payments</w:t>
+            </w:r>
+            <w:proofErr w:type="spellEnd"/>
+            <w:r>
+              <w:t xml:space="preserve">, taxes, </w:t>
+            </w:r>
+            <w:proofErr w:type="spellStart"/>
+            <w:r>
+              <w:t>tax_payments</w:t>
+            </w:r>
+            <w:proofErr w:type="spellEnd"/>
+            <w:r>
+              <w:t xml:space="preserve">, </w:t>
+            </w:r>
+            <w:proofErr w:type="spellStart"/>
+            <w:r>
+              <w:t>class_revenues</w:t>
+            </w:r>
+            <w:proofErr w:type="spellEnd"/>
           </w:p>
         </w:tc>
       </w:tr>
@@ -372,11 +479,27 @@
             <w:vAlign w:val="center"/>
             <w:hideMark/>
           </w:tcPr>
+          <w:p/>
+          <w:p/>
           <w:p>
             <w:r>
               <w:t>Settings</w:t>
             </w:r>
           </w:p>
+          <w:p/>
+          <w:p/>
+          <w:p/>
+          <w:p/>
+          <w:p>
+            <w:pPr>
+              <w:bidi/>
+              <w:rPr>
+                <w:rFonts w:hint="cs"/>
+                <w:rtl/>
+                <w:lang w:bidi="fa-IR"/>
+              </w:rPr>
+            </w:pPr>
+          </w:p>
         </w:tc>
         <w:tc>
           <w:tcPr>
@@ -386,13 +509,2775 @@
           </w:tcPr>
           <w:p>
             <w:r>
-              <w:t>clinics, service_requirements</w:t>
-            </w:r>
-          </w:p>
+              <w:t xml:space="preserve">clinics, </w:t>
+            </w:r>
+            <w:proofErr w:type="spellStart"/>
+            <w:r>
+              <w:t>service_requirements</w:t>
+            </w:r>
+            <w:proofErr w:type="spellEnd"/>
+          </w:p>
+          <w:p/>
+          <w:p/>
+          <w:p/>
+          <w:p/>
+          <w:p/>
         </w:tc>
       </w:tr>
     </w:tbl>
+    <w:p>
+      <w:pPr>
+        <w:rPr>
+          <w:rtl/>
+        </w:rPr>
+      </w:pPr>
+    </w:p>
+    <w:p>
+      <w:pPr>
+        <w:rPr>
+          <w:rtl/>
+        </w:rPr>
+      </w:pPr>
+    </w:p>
+    <w:p>
+      <w:pPr>
+        <w:rPr>
+          <w:rtl/>
+        </w:rPr>
+      </w:pPr>
+    </w:p>
+    <w:p>
+      <w:pPr>
+        <w:bidi/>
+      </w:pPr>
+      <w:r>
+        <w:rPr>
+          <w:rtl/>
+          <w:lang w:bidi="fa-IR"/>
+        </w:rPr>
+        <w:lastRenderedPageBreak/>
+        <w:t>در</w:t>
+      </w:r>
+      <w:r>
+        <w:t xml:space="preserve"> DMS </w:t>
+      </w:r>
+      <w:r>
+        <w:rPr>
+          <w:rtl/>
+          <w:lang w:bidi="fa-IR"/>
+        </w:rPr>
+        <w:t xml:space="preserve">همه </w:t>
+      </w:r>
+      <w:proofErr w:type="spellStart"/>
+      <w:r>
+        <w:rPr>
+          <w:rtl/>
+          <w:lang w:bidi="fa-IR"/>
+        </w:rPr>
+        <w:t>جدول‌ها</w:t>
+      </w:r>
+      <w:proofErr w:type="spellEnd"/>
+      <w:r>
+        <w:rPr>
+          <w:rtl/>
+          <w:lang w:bidi="fa-IR"/>
+        </w:rPr>
+        <w:t xml:space="preserve"> </w:t>
+      </w:r>
+      <w:r>
+        <w:rPr>
+          <w:b/>
+          <w:bCs/>
+        </w:rPr>
+        <w:t xml:space="preserve">CRUD </w:t>
+      </w:r>
+      <w:r>
+        <w:rPr>
+          <w:b/>
+          <w:bCs/>
+          <w:rtl/>
+          <w:lang w:bidi="fa-IR"/>
+        </w:rPr>
+        <w:t>مستقل ندارند</w:t>
+      </w:r>
+      <w:r>
+        <w:t xml:space="preserve">. </w:t>
+      </w:r>
+      <w:proofErr w:type="spellStart"/>
+      <w:r>
+        <w:rPr>
+          <w:rtl/>
+          <w:lang w:bidi="fa-IR"/>
+        </w:rPr>
+        <w:t>بعضی‌ها</w:t>
+      </w:r>
+      <w:proofErr w:type="spellEnd"/>
+      <w:r>
+        <w:rPr>
+          <w:rtl/>
+          <w:lang w:bidi="fa-IR"/>
+        </w:rPr>
+        <w:t xml:space="preserve"> </w:t>
+      </w:r>
+      <w:r>
+        <w:rPr>
+          <w:b/>
+          <w:bCs/>
+        </w:rPr>
+        <w:t>Master Data</w:t>
+      </w:r>
+      <w:r>
+        <w:t xml:space="preserve"> </w:t>
+      </w:r>
+      <w:r>
+        <w:rPr>
+          <w:rtl/>
+          <w:lang w:bidi="fa-IR"/>
+        </w:rPr>
+        <w:t>هستند و</w:t>
+      </w:r>
+      <w:r>
+        <w:t xml:space="preserve"> CRUD </w:t>
+      </w:r>
+      <w:r>
+        <w:rPr>
+          <w:rtl/>
+          <w:lang w:bidi="fa-IR"/>
+        </w:rPr>
+        <w:t xml:space="preserve">کامل دارند، </w:t>
+      </w:r>
+      <w:proofErr w:type="spellStart"/>
+      <w:r>
+        <w:rPr>
+          <w:rtl/>
+          <w:lang w:bidi="fa-IR"/>
+        </w:rPr>
+        <w:t>بعضی‌ها</w:t>
+      </w:r>
+      <w:proofErr w:type="spellEnd"/>
+      <w:r>
+        <w:rPr>
+          <w:rtl/>
+          <w:lang w:bidi="fa-IR"/>
+        </w:rPr>
+        <w:t xml:space="preserve"> </w:t>
+      </w:r>
+      <w:r>
+        <w:rPr>
+          <w:b/>
+          <w:bCs/>
+        </w:rPr>
+        <w:t>Transaction / Detail / Junction</w:t>
+      </w:r>
+      <w:r>
+        <w:t xml:space="preserve"> </w:t>
+      </w:r>
+      <w:r>
+        <w:rPr>
+          <w:rtl/>
+          <w:lang w:bidi="fa-IR"/>
+        </w:rPr>
+        <w:t xml:space="preserve">هستند و از طریق عملیات والد مدیریت </w:t>
+      </w:r>
+      <w:proofErr w:type="spellStart"/>
+      <w:r>
+        <w:rPr>
+          <w:rtl/>
+          <w:lang w:bidi="fa-IR"/>
+        </w:rPr>
+        <w:t>می‌شوند</w:t>
+      </w:r>
+      <w:proofErr w:type="spellEnd"/>
+      <w:r>
+        <w:t>.</w:t>
+      </w:r>
+    </w:p>
+    <w:p>
+      <w:pPr>
+        <w:bidi/>
+      </w:pPr>
+      <w:proofErr w:type="spellStart"/>
+      <w:r>
+        <w:rPr>
+          <w:rtl/>
+          <w:lang w:bidi="fa-IR"/>
+        </w:rPr>
+        <w:t>تقسیم‌بندی</w:t>
+      </w:r>
+      <w:proofErr w:type="spellEnd"/>
+      <w:r>
+        <w:rPr>
+          <w:rtl/>
+          <w:lang w:bidi="fa-IR"/>
+        </w:rPr>
+        <w:t xml:space="preserve"> پیشنهادی</w:t>
+      </w:r>
+      <w:r>
+        <w:t>:</w:t>
+      </w:r>
+    </w:p>
+    <w:p>
+      <w:pPr>
+        <w:bidi/>
+        <w:rPr>
+          <w:b/>
+          <w:bCs/>
+        </w:rPr>
+      </w:pPr>
+      <w:r>
+        <w:rPr>
+          <w:rFonts w:ascii="Segoe UI Emoji" w:hAnsi="Segoe UI Emoji" w:cs="Segoe UI Emoji"/>
+          <w:b/>
+          <w:bCs/>
+        </w:rPr>
+        <w:t>✅</w:t>
+      </w:r>
+      <w:r>
+        <w:rPr>
+          <w:b/>
+          <w:bCs/>
+        </w:rPr>
+        <w:t xml:space="preserve"> </w:t>
+      </w:r>
+      <w:proofErr w:type="spellStart"/>
+      <w:r>
+        <w:rPr>
+          <w:b/>
+          <w:bCs/>
+          <w:rtl/>
+          <w:lang w:bidi="fa-IR"/>
+        </w:rPr>
+        <w:t>جدول‌های</w:t>
+      </w:r>
+      <w:proofErr w:type="spellEnd"/>
+      <w:r>
+        <w:rPr>
+          <w:b/>
+          <w:bCs/>
+          <w:rtl/>
+          <w:lang w:bidi="fa-IR"/>
+        </w:rPr>
+        <w:t xml:space="preserve"> دارای</w:t>
+      </w:r>
+      <w:r>
+        <w:rPr>
+          <w:b/>
+          <w:bCs/>
+        </w:rPr>
+        <w:t xml:space="preserve"> CRUD </w:t>
+      </w:r>
+      <w:r>
+        <w:rPr>
+          <w:b/>
+          <w:bCs/>
+          <w:rtl/>
+          <w:lang w:bidi="fa-IR"/>
+        </w:rPr>
+        <w:t>مستقل</w:t>
+      </w:r>
+    </w:p>
+    <w:p>
+      <w:pPr>
+        <w:bidi/>
+      </w:pPr>
+      <w:proofErr w:type="spellStart"/>
+      <w:r>
+        <w:rPr>
+          <w:rtl/>
+          <w:lang w:bidi="fa-IR"/>
+        </w:rPr>
+        <w:t>این‌ها</w:t>
+      </w:r>
+      <w:proofErr w:type="spellEnd"/>
+      <w:r>
+        <w:rPr>
+          <w:rtl/>
+          <w:lang w:bidi="fa-IR"/>
+        </w:rPr>
+        <w:t xml:space="preserve"> صفحه مستقل در سیستم دارند</w:t>
+      </w:r>
+      <w:r>
+        <w:t>:</w:t>
+      </w:r>
+    </w:p>
+    <w:tbl>
+      <w:tblPr>
+        <w:tblStyle w:val="GridTable4-Accent2"/>
+        <w:tblW w:w="0" w:type="auto"/>
+        <w:jc w:val="center"/>
+        <w:tblLook w:val="04A0" w:firstRow="1" w:lastRow="0" w:firstColumn="1" w:lastColumn="0" w:noHBand="0" w:noVBand="1"/>
+      </w:tblPr>
+      <w:tblGrid>
+        <w:gridCol w:w="2609"/>
+        <w:gridCol w:w="1211"/>
+        <w:gridCol w:w="2884"/>
+      </w:tblGrid>
+      <w:tr>
+        <w:trPr>
+          <w:cnfStyle w:val="100000000000" w:firstRow="1" w:lastRow="0" w:firstColumn="0" w:lastColumn="0" w:oddVBand="0" w:evenVBand="0" w:oddHBand="0" w:evenHBand="0" w:firstRowFirstColumn="0" w:firstRowLastColumn="0" w:lastRowFirstColumn="0" w:lastRowLastColumn="0"/>
+          <w:jc w:val="center"/>
+        </w:trPr>
+        <w:tc>
+          <w:tcPr>
+            <w:cnfStyle w:val="001000000000" w:firstRow="0" w:lastRow="0" w:firstColumn="1" w:lastColumn="0" w:oddVBand="0" w:evenVBand="0" w:oddHBand="0" w:evenHBand="0" w:firstRowFirstColumn="0" w:firstRowLastColumn="0" w:lastRowFirstColumn="0" w:lastRowLastColumn="0"/>
+            <w:tcW w:w="0" w:type="auto"/>
+            <w:hideMark/>
+          </w:tcPr>
+          <w:p>
+            <w:pPr>
+              <w:bidi/>
+              <w:spacing w:after="160" w:line="278" w:lineRule="auto"/>
+              <w:rPr>
+                <w:rFonts w:hint="cs"/>
+                <w:rtl/>
+                <w:lang w:bidi="fa-IR"/>
+              </w:rPr>
+            </w:pPr>
+            <w:r>
+              <w:t>Table</w:t>
+            </w:r>
+          </w:p>
+        </w:tc>
+        <w:tc>
+          <w:tcPr>
+            <w:tcW w:w="0" w:type="auto"/>
+            <w:hideMark/>
+          </w:tcPr>
+          <w:p>
+            <w:pPr>
+              <w:bidi/>
+              <w:spacing w:after="160" w:line="278" w:lineRule="auto"/>
+              <w:cnfStyle w:val="100000000000" w:firstRow="1" w:lastRow="0" w:firstColumn="0" w:lastColumn="0" w:oddVBand="0" w:evenVBand="0" w:oddHBand="0" w:evenHBand="0" w:firstRowFirstColumn="0" w:firstRowLastColumn="0" w:lastRowFirstColumn="0" w:lastRowLastColumn="0"/>
+            </w:pPr>
+            <w:r>
+              <w:t>CRUD</w:t>
+            </w:r>
+          </w:p>
+        </w:tc>
+        <w:tc>
+          <w:tcPr>
+            <w:tcW w:w="0" w:type="auto"/>
+            <w:hideMark/>
+          </w:tcPr>
+          <w:p>
+            <w:pPr>
+              <w:bidi/>
+              <w:spacing w:after="160" w:line="278" w:lineRule="auto"/>
+              <w:cnfStyle w:val="100000000000" w:firstRow="1" w:lastRow="0" w:firstColumn="0" w:lastColumn="0" w:oddVBand="0" w:evenVBand="0" w:oddHBand="0" w:evenHBand="0" w:firstRowFirstColumn="0" w:firstRowLastColumn="0" w:lastRowFirstColumn="0" w:lastRowLastColumn="0"/>
+            </w:pPr>
+            <w:r>
+              <w:rPr>
+                <w:rtl/>
+                <w:lang w:bidi="fa-IR"/>
+              </w:rPr>
+              <w:t>توضیح</w:t>
+            </w:r>
+          </w:p>
+        </w:tc>
+      </w:tr>
+      <w:tr>
+        <w:trPr>
+          <w:cnfStyle w:val="000000100000" w:firstRow="0" w:lastRow="0" w:firstColumn="0" w:lastColumn="0" w:oddVBand="0" w:evenVBand="0" w:oddHBand="1" w:evenHBand="0" w:firstRowFirstColumn="0" w:firstRowLastColumn="0" w:lastRowFirstColumn="0" w:lastRowLastColumn="0"/>
+          <w:jc w:val="center"/>
+        </w:trPr>
+        <w:tc>
+          <w:tcPr>
+            <w:cnfStyle w:val="001000000000" w:firstRow="0" w:lastRow="0" w:firstColumn="1" w:lastColumn="0" w:oddVBand="0" w:evenVBand="0" w:oddHBand="0" w:evenHBand="0" w:firstRowFirstColumn="0" w:firstRowLastColumn="0" w:lastRowFirstColumn="0" w:lastRowLastColumn="0"/>
+            <w:tcW w:w="0" w:type="auto"/>
+            <w:hideMark/>
+          </w:tcPr>
+          <w:p>
+            <w:pPr>
+              <w:bidi/>
+              <w:spacing w:after="160" w:line="278" w:lineRule="auto"/>
+            </w:pPr>
+            <w:r>
+              <w:t>patients</w:t>
+            </w:r>
+          </w:p>
+        </w:tc>
+        <w:tc>
+          <w:tcPr>
+            <w:tcW w:w="0" w:type="auto"/>
+            <w:hideMark/>
+          </w:tcPr>
+          <w:p>
+            <w:pPr>
+              <w:bidi/>
+              <w:spacing w:after="160" w:line="278" w:lineRule="auto"/>
+              <w:cnfStyle w:val="000000100000" w:firstRow="0" w:lastRow="0" w:firstColumn="0" w:lastColumn="0" w:oddVBand="0" w:evenVBand="0" w:oddHBand="1" w:evenHBand="0" w:firstRowFirstColumn="0" w:firstRowLastColumn="0" w:lastRowFirstColumn="0" w:lastRowLastColumn="0"/>
+            </w:pPr>
+            <w:r>
+              <w:rPr>
+                <w:rFonts w:ascii="Segoe UI Emoji" w:hAnsi="Segoe UI Emoji" w:cs="Segoe UI Emoji"/>
+              </w:rPr>
+              <w:t>✅</w:t>
+            </w:r>
+            <w:r>
+              <w:t xml:space="preserve"> </w:t>
+            </w:r>
+            <w:r>
+              <w:rPr>
+                <w:rtl/>
+                <w:lang w:bidi="fa-IR"/>
+              </w:rPr>
+              <w:t>کامل</w:t>
+            </w:r>
+          </w:p>
+        </w:tc>
+        <w:tc>
+          <w:tcPr>
+            <w:tcW w:w="0" w:type="auto"/>
+            <w:hideMark/>
+          </w:tcPr>
+          <w:p>
+            <w:pPr>
+              <w:bidi/>
+              <w:spacing w:after="160" w:line="278" w:lineRule="auto"/>
+              <w:cnfStyle w:val="000000100000" w:firstRow="0" w:lastRow="0" w:firstColumn="0" w:lastColumn="0" w:oddVBand="0" w:evenVBand="0" w:oddHBand="1" w:evenHBand="0" w:firstRowFirstColumn="0" w:firstRowLastColumn="0" w:lastRowFirstColumn="0" w:lastRowLastColumn="0"/>
+            </w:pPr>
+            <w:r>
+              <w:rPr>
+                <w:rtl/>
+                <w:lang w:bidi="fa-IR"/>
+              </w:rPr>
+              <w:t>مدیریت بیماران</w:t>
+            </w:r>
+          </w:p>
+        </w:tc>
+      </w:tr>
+      <w:tr>
+        <w:trPr>
+          <w:jc w:val="center"/>
+        </w:trPr>
+        <w:tc>
+          <w:tcPr>
+            <w:cnfStyle w:val="001000000000" w:firstRow="0" w:lastRow="0" w:firstColumn="1" w:lastColumn="0" w:oddVBand="0" w:evenVBand="0" w:oddHBand="0" w:evenHBand="0" w:firstRowFirstColumn="0" w:firstRowLastColumn="0" w:lastRowFirstColumn="0" w:lastRowLastColumn="0"/>
+            <w:tcW w:w="0" w:type="auto"/>
+            <w:hideMark/>
+          </w:tcPr>
+          <w:p>
+            <w:pPr>
+              <w:bidi/>
+              <w:spacing w:after="160" w:line="278" w:lineRule="auto"/>
+            </w:pPr>
+            <w:r>
+              <w:t>staff</w:t>
+            </w:r>
+          </w:p>
+        </w:tc>
+        <w:tc>
+          <w:tcPr>
+            <w:tcW w:w="0" w:type="auto"/>
+            <w:hideMark/>
+          </w:tcPr>
+          <w:p>
+            <w:pPr>
+              <w:bidi/>
+              <w:spacing w:after="160" w:line="278" w:lineRule="auto"/>
+              <w:cnfStyle w:val="000000000000" w:firstRow="0" w:lastRow="0" w:firstColumn="0" w:lastColumn="0" w:oddVBand="0" w:evenVBand="0" w:oddHBand="0" w:evenHBand="0" w:firstRowFirstColumn="0" w:firstRowLastColumn="0" w:lastRowFirstColumn="0" w:lastRowLastColumn="0"/>
+            </w:pPr>
+            <w:r>
+              <w:rPr>
+                <w:rFonts w:ascii="Segoe UI Emoji" w:hAnsi="Segoe UI Emoji" w:cs="Segoe UI Emoji"/>
+              </w:rPr>
+              <w:t>✅</w:t>
+            </w:r>
+            <w:r>
+              <w:t xml:space="preserve"> </w:t>
+            </w:r>
+            <w:r>
+              <w:rPr>
+                <w:rtl/>
+                <w:lang w:bidi="fa-IR"/>
+              </w:rPr>
+              <w:t>کامل</w:t>
+            </w:r>
+          </w:p>
+        </w:tc>
+        <w:tc>
+          <w:tcPr>
+            <w:tcW w:w="0" w:type="auto"/>
+            <w:hideMark/>
+          </w:tcPr>
+          <w:p>
+            <w:pPr>
+              <w:bidi/>
+              <w:spacing w:after="160" w:line="278" w:lineRule="auto"/>
+              <w:cnfStyle w:val="000000000000" w:firstRow="0" w:lastRow="0" w:firstColumn="0" w:lastColumn="0" w:oddVBand="0" w:evenVBand="0" w:oddHBand="0" w:evenHBand="0" w:firstRowFirstColumn="0" w:firstRowLastColumn="0" w:lastRowFirstColumn="0" w:lastRowLastColumn="0"/>
+            </w:pPr>
+            <w:r>
+              <w:rPr>
+                <w:rtl/>
+                <w:lang w:bidi="fa-IR"/>
+              </w:rPr>
+              <w:t>کارمندان، داکترها</w:t>
+            </w:r>
+          </w:p>
+        </w:tc>
+      </w:tr>
+      <w:tr>
+        <w:trPr>
+          <w:cnfStyle w:val="000000100000" w:firstRow="0" w:lastRow="0" w:firstColumn="0" w:lastColumn="0" w:oddVBand="0" w:evenVBand="0" w:oddHBand="1" w:evenHBand="0" w:firstRowFirstColumn="0" w:firstRowLastColumn="0" w:lastRowFirstColumn="0" w:lastRowLastColumn="0"/>
+          <w:jc w:val="center"/>
+        </w:trPr>
+        <w:tc>
+          <w:tcPr>
+            <w:cnfStyle w:val="001000000000" w:firstRow="0" w:lastRow="0" w:firstColumn="1" w:lastColumn="0" w:oddVBand="0" w:evenVBand="0" w:oddHBand="0" w:evenHBand="0" w:firstRowFirstColumn="0" w:firstRowLastColumn="0" w:lastRowFirstColumn="0" w:lastRowLastColumn="0"/>
+            <w:tcW w:w="0" w:type="auto"/>
+            <w:hideMark/>
+          </w:tcPr>
+          <w:p>
+            <w:pPr>
+              <w:bidi/>
+              <w:spacing w:after="160" w:line="278" w:lineRule="auto"/>
+            </w:pPr>
+            <w:r>
+              <w:t>clinics</w:t>
+            </w:r>
+          </w:p>
+        </w:tc>
+        <w:tc>
+          <w:tcPr>
+            <w:tcW w:w="0" w:type="auto"/>
+            <w:hideMark/>
+          </w:tcPr>
+          <w:p>
+            <w:pPr>
+              <w:bidi/>
+              <w:spacing w:after="160" w:line="278" w:lineRule="auto"/>
+              <w:cnfStyle w:val="000000100000" w:firstRow="0" w:lastRow="0" w:firstColumn="0" w:lastColumn="0" w:oddVBand="0" w:evenVBand="0" w:oddHBand="1" w:evenHBand="0" w:firstRowFirstColumn="0" w:firstRowLastColumn="0" w:lastRowFirstColumn="0" w:lastRowLastColumn="0"/>
+            </w:pPr>
+            <w:r>
+              <w:rPr>
+                <w:rFonts w:ascii="Segoe UI Emoji" w:hAnsi="Segoe UI Emoji" w:cs="Segoe UI Emoji"/>
+              </w:rPr>
+              <w:t>✅</w:t>
+            </w:r>
+            <w:r>
+              <w:t xml:space="preserve"> </w:t>
+            </w:r>
+            <w:r>
+              <w:rPr>
+                <w:rtl/>
+                <w:lang w:bidi="fa-IR"/>
+              </w:rPr>
+              <w:t>کامل</w:t>
+            </w:r>
+          </w:p>
+        </w:tc>
+        <w:tc>
+          <w:tcPr>
+            <w:tcW w:w="0" w:type="auto"/>
+            <w:hideMark/>
+          </w:tcPr>
+          <w:p>
+            <w:pPr>
+              <w:bidi/>
+              <w:spacing w:after="160" w:line="278" w:lineRule="auto"/>
+              <w:cnfStyle w:val="000000100000" w:firstRow="0" w:lastRow="0" w:firstColumn="0" w:lastColumn="0" w:oddVBand="0" w:evenVBand="0" w:oddHBand="1" w:evenHBand="0" w:firstRowFirstColumn="0" w:firstRowLastColumn="0" w:lastRowFirstColumn="0" w:lastRowLastColumn="0"/>
+            </w:pPr>
+            <w:proofErr w:type="spellStart"/>
+            <w:r>
+              <w:rPr>
+                <w:rtl/>
+                <w:lang w:bidi="fa-IR"/>
+              </w:rPr>
+              <w:t>کلینیک‌ها</w:t>
+            </w:r>
+            <w:proofErr w:type="spellEnd"/>
+          </w:p>
+        </w:tc>
+      </w:tr>
+      <w:tr>
+        <w:trPr>
+          <w:jc w:val="center"/>
+        </w:trPr>
+        <w:tc>
+          <w:tcPr>
+            <w:cnfStyle w:val="001000000000" w:firstRow="0" w:lastRow="0" w:firstColumn="1" w:lastColumn="0" w:oddVBand="0" w:evenVBand="0" w:oddHBand="0" w:evenHBand="0" w:firstRowFirstColumn="0" w:firstRowLastColumn="0" w:lastRowFirstColumn="0" w:lastRowLastColumn="0"/>
+            <w:tcW w:w="0" w:type="auto"/>
+            <w:hideMark/>
+          </w:tcPr>
+          <w:p>
+            <w:pPr>
+              <w:bidi/>
+              <w:spacing w:after="160" w:line="278" w:lineRule="auto"/>
+            </w:pPr>
+            <w:r>
+              <w:t>services</w:t>
+            </w:r>
+          </w:p>
+        </w:tc>
+        <w:tc>
+          <w:tcPr>
+            <w:tcW w:w="0" w:type="auto"/>
+            <w:hideMark/>
+          </w:tcPr>
+          <w:p>
+            <w:pPr>
+              <w:bidi/>
+              <w:spacing w:after="160" w:line="278" w:lineRule="auto"/>
+              <w:cnfStyle w:val="000000000000" w:firstRow="0" w:lastRow="0" w:firstColumn="0" w:lastColumn="0" w:oddVBand="0" w:evenVBand="0" w:oddHBand="0" w:evenHBand="0" w:firstRowFirstColumn="0" w:firstRowLastColumn="0" w:lastRowFirstColumn="0" w:lastRowLastColumn="0"/>
+            </w:pPr>
+            <w:r>
+              <w:rPr>
+                <w:rFonts w:ascii="Segoe UI Emoji" w:hAnsi="Segoe UI Emoji" w:cs="Segoe UI Emoji"/>
+              </w:rPr>
+              <w:t>✅</w:t>
+            </w:r>
+            <w:r>
+              <w:t xml:space="preserve"> </w:t>
+            </w:r>
+            <w:r>
+              <w:rPr>
+                <w:rtl/>
+                <w:lang w:bidi="fa-IR"/>
+              </w:rPr>
+              <w:t>کامل</w:t>
+            </w:r>
+          </w:p>
+        </w:tc>
+        <w:tc>
+          <w:tcPr>
+            <w:tcW w:w="0" w:type="auto"/>
+            <w:hideMark/>
+          </w:tcPr>
+          <w:p>
+            <w:pPr>
+              <w:bidi/>
+              <w:spacing w:after="160" w:line="278" w:lineRule="auto"/>
+              <w:cnfStyle w:val="000000000000" w:firstRow="0" w:lastRow="0" w:firstColumn="0" w:lastColumn="0" w:oddVBand="0" w:evenVBand="0" w:oddHBand="0" w:evenHBand="0" w:firstRowFirstColumn="0" w:firstRowLastColumn="0" w:lastRowFirstColumn="0" w:lastRowLastColumn="0"/>
+            </w:pPr>
+            <w:r>
+              <w:rPr>
+                <w:rtl/>
+                <w:lang w:bidi="fa-IR"/>
+              </w:rPr>
+              <w:t xml:space="preserve">خدمات </w:t>
+            </w:r>
+            <w:proofErr w:type="spellStart"/>
+            <w:r>
+              <w:rPr>
+                <w:rtl/>
+                <w:lang w:bidi="fa-IR"/>
+              </w:rPr>
+              <w:t>دندان‌پزشکی</w:t>
+            </w:r>
+            <w:proofErr w:type="spellEnd"/>
+          </w:p>
+        </w:tc>
+      </w:tr>
+      <w:tr>
+        <w:trPr>
+          <w:cnfStyle w:val="000000100000" w:firstRow="0" w:lastRow="0" w:firstColumn="0" w:lastColumn="0" w:oddVBand="0" w:evenVBand="0" w:oddHBand="1" w:evenHBand="0" w:firstRowFirstColumn="0" w:firstRowLastColumn="0" w:lastRowFirstColumn="0" w:lastRowLastColumn="0"/>
+          <w:jc w:val="center"/>
+        </w:trPr>
+        <w:tc>
+          <w:tcPr>
+            <w:cnfStyle w:val="001000000000" w:firstRow="0" w:lastRow="0" w:firstColumn="1" w:lastColumn="0" w:oddVBand="0" w:evenVBand="0" w:oddHBand="0" w:evenHBand="0" w:firstRowFirstColumn="0" w:firstRowLastColumn="0" w:lastRowFirstColumn="0" w:lastRowLastColumn="0"/>
+            <w:tcW w:w="0" w:type="auto"/>
+            <w:hideMark/>
+          </w:tcPr>
+          <w:p>
+            <w:pPr>
+              <w:bidi/>
+              <w:spacing w:after="160" w:line="278" w:lineRule="auto"/>
+            </w:pPr>
+            <w:r>
+              <w:t>conditions</w:t>
+            </w:r>
+          </w:p>
+        </w:tc>
+        <w:tc>
+          <w:tcPr>
+            <w:tcW w:w="0" w:type="auto"/>
+            <w:hideMark/>
+          </w:tcPr>
+          <w:p>
+            <w:pPr>
+              <w:bidi/>
+              <w:spacing w:after="160" w:line="278" w:lineRule="auto"/>
+              <w:cnfStyle w:val="000000100000" w:firstRow="0" w:lastRow="0" w:firstColumn="0" w:lastColumn="0" w:oddVBand="0" w:evenVBand="0" w:oddHBand="1" w:evenHBand="0" w:firstRowFirstColumn="0" w:firstRowLastColumn="0" w:lastRowFirstColumn="0" w:lastRowLastColumn="0"/>
+            </w:pPr>
+            <w:r>
+              <w:rPr>
+                <w:rFonts w:ascii="Segoe UI Emoji" w:hAnsi="Segoe UI Emoji" w:cs="Segoe UI Emoji"/>
+              </w:rPr>
+              <w:t>✅</w:t>
+            </w:r>
+            <w:r>
+              <w:t xml:space="preserve"> </w:t>
+            </w:r>
+            <w:r>
+              <w:rPr>
+                <w:rtl/>
+                <w:lang w:bidi="fa-IR"/>
+              </w:rPr>
+              <w:t>کامل</w:t>
+            </w:r>
+          </w:p>
+        </w:tc>
+        <w:tc>
+          <w:tcPr>
+            <w:tcW w:w="0" w:type="auto"/>
+            <w:hideMark/>
+          </w:tcPr>
+          <w:p>
+            <w:pPr>
+              <w:bidi/>
+              <w:spacing w:after="160" w:line="278" w:lineRule="auto"/>
+              <w:cnfStyle w:val="000000100000" w:firstRow="0" w:lastRow="0" w:firstColumn="0" w:lastColumn="0" w:oddVBand="0" w:evenVBand="0" w:oddHBand="1" w:evenHBand="0" w:firstRowFirstColumn="0" w:firstRowLastColumn="0" w:lastRowFirstColumn="0" w:lastRowLastColumn="0"/>
+            </w:pPr>
+            <w:proofErr w:type="spellStart"/>
+            <w:r>
+              <w:rPr>
+                <w:rtl/>
+                <w:lang w:bidi="fa-IR"/>
+              </w:rPr>
+              <w:t>بیماری‌ها</w:t>
+            </w:r>
+            <w:proofErr w:type="spellEnd"/>
+            <w:r>
+              <w:rPr>
+                <w:rtl/>
+                <w:lang w:bidi="fa-IR"/>
+              </w:rPr>
+              <w:t xml:space="preserve"> / </w:t>
+            </w:r>
+            <w:proofErr w:type="spellStart"/>
+            <w:r>
+              <w:rPr>
+                <w:rtl/>
+                <w:lang w:bidi="fa-IR"/>
+              </w:rPr>
+              <w:t>تشخیص‌ها</w:t>
+            </w:r>
+            <w:proofErr w:type="spellEnd"/>
+          </w:p>
+        </w:tc>
+      </w:tr>
+      <w:tr>
+        <w:trPr>
+          <w:jc w:val="center"/>
+        </w:trPr>
+        <w:tc>
+          <w:tcPr>
+            <w:cnfStyle w:val="001000000000" w:firstRow="0" w:lastRow="0" w:firstColumn="1" w:lastColumn="0" w:oddVBand="0" w:evenVBand="0" w:oddHBand="0" w:evenHBand="0" w:firstRowFirstColumn="0" w:firstRowLastColumn="0" w:lastRowFirstColumn="0" w:lastRowLastColumn="0"/>
+            <w:tcW w:w="0" w:type="auto"/>
+            <w:hideMark/>
+          </w:tcPr>
+          <w:p>
+            <w:pPr>
+              <w:bidi/>
+              <w:spacing w:after="160" w:line="278" w:lineRule="auto"/>
+            </w:pPr>
+            <w:r>
+              <w:t>labs</w:t>
+            </w:r>
+          </w:p>
+        </w:tc>
+        <w:tc>
+          <w:tcPr>
+            <w:tcW w:w="0" w:type="auto"/>
+            <w:hideMark/>
+          </w:tcPr>
+          <w:p>
+            <w:pPr>
+              <w:bidi/>
+              <w:spacing w:after="160" w:line="278" w:lineRule="auto"/>
+              <w:cnfStyle w:val="000000000000" w:firstRow="0" w:lastRow="0" w:firstColumn="0" w:lastColumn="0" w:oddVBand="0" w:evenVBand="0" w:oddHBand="0" w:evenHBand="0" w:firstRowFirstColumn="0" w:firstRowLastColumn="0" w:lastRowFirstColumn="0" w:lastRowLastColumn="0"/>
+            </w:pPr>
+            <w:r>
+              <w:rPr>
+                <w:rFonts w:ascii="Segoe UI Emoji" w:hAnsi="Segoe UI Emoji" w:cs="Segoe UI Emoji"/>
+              </w:rPr>
+              <w:t>✅</w:t>
+            </w:r>
+            <w:r>
+              <w:t xml:space="preserve"> </w:t>
+            </w:r>
+            <w:r>
+              <w:rPr>
+                <w:rtl/>
+                <w:lang w:bidi="fa-IR"/>
+              </w:rPr>
+              <w:t>کامل</w:t>
+            </w:r>
+          </w:p>
+        </w:tc>
+        <w:tc>
+          <w:tcPr>
+            <w:tcW w:w="0" w:type="auto"/>
+            <w:hideMark/>
+          </w:tcPr>
+          <w:p>
+            <w:pPr>
+              <w:bidi/>
+              <w:spacing w:after="160" w:line="278" w:lineRule="auto"/>
+              <w:cnfStyle w:val="000000000000" w:firstRow="0" w:lastRow="0" w:firstColumn="0" w:lastColumn="0" w:oddVBand="0" w:evenVBand="0" w:oddHBand="0" w:evenHBand="0" w:firstRowFirstColumn="0" w:firstRowLastColumn="0" w:lastRowFirstColumn="0" w:lastRowLastColumn="0"/>
+            </w:pPr>
+            <w:proofErr w:type="spellStart"/>
+            <w:r>
+              <w:rPr>
+                <w:rtl/>
+                <w:lang w:bidi="fa-IR"/>
+              </w:rPr>
+              <w:t>لابراتوارها</w:t>
+            </w:r>
+            <w:proofErr w:type="spellEnd"/>
+          </w:p>
+        </w:tc>
+      </w:tr>
+      <w:tr>
+        <w:trPr>
+          <w:cnfStyle w:val="000000100000" w:firstRow="0" w:lastRow="0" w:firstColumn="0" w:lastColumn="0" w:oddVBand="0" w:evenVBand="0" w:oddHBand="1" w:evenHBand="0" w:firstRowFirstColumn="0" w:firstRowLastColumn="0" w:lastRowFirstColumn="0" w:lastRowLastColumn="0"/>
+          <w:jc w:val="center"/>
+        </w:trPr>
+        <w:tc>
+          <w:tcPr>
+            <w:cnfStyle w:val="001000000000" w:firstRow="0" w:lastRow="0" w:firstColumn="1" w:lastColumn="0" w:oddVBand="0" w:evenVBand="0" w:oddHBand="0" w:evenHBand="0" w:firstRowFirstColumn="0" w:firstRowLastColumn="0" w:lastRowFirstColumn="0" w:lastRowLastColumn="0"/>
+            <w:tcW w:w="0" w:type="auto"/>
+            <w:hideMark/>
+          </w:tcPr>
+          <w:p>
+            <w:pPr>
+              <w:bidi/>
+              <w:spacing w:after="160" w:line="278" w:lineRule="auto"/>
+            </w:pPr>
+            <w:proofErr w:type="spellStart"/>
+            <w:r>
+              <w:t>supplies_inventory</w:t>
+            </w:r>
+            <w:proofErr w:type="spellEnd"/>
+          </w:p>
+        </w:tc>
+        <w:tc>
+          <w:tcPr>
+            <w:tcW w:w="0" w:type="auto"/>
+            <w:hideMark/>
+          </w:tcPr>
+          <w:p>
+            <w:pPr>
+              <w:bidi/>
+              <w:spacing w:after="160" w:line="278" w:lineRule="auto"/>
+              <w:cnfStyle w:val="000000100000" w:firstRow="0" w:lastRow="0" w:firstColumn="0" w:lastColumn="0" w:oddVBand="0" w:evenVBand="0" w:oddHBand="1" w:evenHBand="0" w:firstRowFirstColumn="0" w:firstRowLastColumn="0" w:lastRowFirstColumn="0" w:lastRowLastColumn="0"/>
+            </w:pPr>
+            <w:r>
+              <w:rPr>
+                <w:rFonts w:ascii="Segoe UI Emoji" w:hAnsi="Segoe UI Emoji" w:cs="Segoe UI Emoji"/>
+              </w:rPr>
+              <w:t>✅</w:t>
+            </w:r>
+            <w:r>
+              <w:t xml:space="preserve"> </w:t>
+            </w:r>
+            <w:r>
+              <w:rPr>
+                <w:rtl/>
+                <w:lang w:bidi="fa-IR"/>
+              </w:rPr>
+              <w:t>کامل</w:t>
+            </w:r>
+          </w:p>
+        </w:tc>
+        <w:tc>
+          <w:tcPr>
+            <w:tcW w:w="0" w:type="auto"/>
+            <w:hideMark/>
+          </w:tcPr>
+          <w:p>
+            <w:pPr>
+              <w:bidi/>
+              <w:spacing w:after="160" w:line="278" w:lineRule="auto"/>
+              <w:cnfStyle w:val="000000100000" w:firstRow="0" w:lastRow="0" w:firstColumn="0" w:lastColumn="0" w:oddVBand="0" w:evenVBand="0" w:oddHBand="1" w:evenHBand="0" w:firstRowFirstColumn="0" w:firstRowLastColumn="0" w:lastRowFirstColumn="0" w:lastRowLastColumn="0"/>
+            </w:pPr>
+            <w:r>
+              <w:rPr>
+                <w:rtl/>
+                <w:lang w:bidi="fa-IR"/>
+              </w:rPr>
+              <w:t>اقلام مصرفی</w:t>
+            </w:r>
+          </w:p>
+        </w:tc>
+      </w:tr>
+      <w:tr>
+        <w:trPr>
+          <w:jc w:val="center"/>
+        </w:trPr>
+        <w:tc>
+          <w:tcPr>
+            <w:cnfStyle w:val="001000000000" w:firstRow="0" w:lastRow="0" w:firstColumn="1" w:lastColumn="0" w:oddVBand="0" w:evenVBand="0" w:oddHBand="0" w:evenHBand="0" w:firstRowFirstColumn="0" w:firstRowLastColumn="0" w:lastRowFirstColumn="0" w:lastRowLastColumn="0"/>
+            <w:tcW w:w="0" w:type="auto"/>
+            <w:hideMark/>
+          </w:tcPr>
+          <w:p>
+            <w:pPr>
+              <w:bidi/>
+              <w:spacing w:after="160" w:line="278" w:lineRule="auto"/>
+            </w:pPr>
+            <w:proofErr w:type="spellStart"/>
+            <w:r>
+              <w:t>medicine_inventory</w:t>
+            </w:r>
+            <w:proofErr w:type="spellEnd"/>
+          </w:p>
+        </w:tc>
+        <w:tc>
+          <w:tcPr>
+            <w:tcW w:w="0" w:type="auto"/>
+            <w:hideMark/>
+          </w:tcPr>
+          <w:p>
+            <w:pPr>
+              <w:bidi/>
+              <w:spacing w:after="160" w:line="278" w:lineRule="auto"/>
+              <w:cnfStyle w:val="000000000000" w:firstRow="0" w:lastRow="0" w:firstColumn="0" w:lastColumn="0" w:oddVBand="0" w:evenVBand="0" w:oddHBand="0" w:evenHBand="0" w:firstRowFirstColumn="0" w:firstRowLastColumn="0" w:lastRowFirstColumn="0" w:lastRowLastColumn="0"/>
+            </w:pPr>
+            <w:r>
+              <w:rPr>
+                <w:rFonts w:ascii="Segoe UI Emoji" w:hAnsi="Segoe UI Emoji" w:cs="Segoe UI Emoji"/>
+              </w:rPr>
+              <w:t>✅</w:t>
+            </w:r>
+            <w:r>
+              <w:t xml:space="preserve"> </w:t>
+            </w:r>
+            <w:r>
+              <w:rPr>
+                <w:rtl/>
+                <w:lang w:bidi="fa-IR"/>
+              </w:rPr>
+              <w:t>کامل</w:t>
+            </w:r>
+          </w:p>
+        </w:tc>
+        <w:tc>
+          <w:tcPr>
+            <w:tcW w:w="0" w:type="auto"/>
+            <w:hideMark/>
+          </w:tcPr>
+          <w:p>
+            <w:pPr>
+              <w:bidi/>
+              <w:spacing w:after="160" w:line="278" w:lineRule="auto"/>
+              <w:cnfStyle w:val="000000000000" w:firstRow="0" w:lastRow="0" w:firstColumn="0" w:lastColumn="0" w:oddVBand="0" w:evenVBand="0" w:oddHBand="0" w:evenHBand="0" w:firstRowFirstColumn="0" w:firstRowLastColumn="0" w:lastRowFirstColumn="0" w:lastRowLastColumn="0"/>
+            </w:pPr>
+            <w:r>
+              <w:rPr>
+                <w:rtl/>
+                <w:lang w:bidi="fa-IR"/>
+              </w:rPr>
+              <w:t>دواها</w:t>
+            </w:r>
+          </w:p>
+        </w:tc>
+      </w:tr>
+      <w:tr>
+        <w:trPr>
+          <w:cnfStyle w:val="000000100000" w:firstRow="0" w:lastRow="0" w:firstColumn="0" w:lastColumn="0" w:oddVBand="0" w:evenVBand="0" w:oddHBand="1" w:evenHBand="0" w:firstRowFirstColumn="0" w:firstRowLastColumn="0" w:lastRowFirstColumn="0" w:lastRowLastColumn="0"/>
+          <w:jc w:val="center"/>
+        </w:trPr>
+        <w:tc>
+          <w:tcPr>
+            <w:cnfStyle w:val="001000000000" w:firstRow="0" w:lastRow="0" w:firstColumn="1" w:lastColumn="0" w:oddVBand="0" w:evenVBand="0" w:oddHBand="0" w:evenHBand="0" w:firstRowFirstColumn="0" w:firstRowLastColumn="0" w:lastRowFirstColumn="0" w:lastRowLastColumn="0"/>
+            <w:tcW w:w="0" w:type="auto"/>
+            <w:hideMark/>
+          </w:tcPr>
+          <w:p>
+            <w:pPr>
+              <w:bidi/>
+              <w:spacing w:after="160" w:line="278" w:lineRule="auto"/>
+            </w:pPr>
+            <w:r>
+              <w:lastRenderedPageBreak/>
+              <w:t>taxes</w:t>
+            </w:r>
+          </w:p>
+        </w:tc>
+        <w:tc>
+          <w:tcPr>
+            <w:tcW w:w="0" w:type="auto"/>
+            <w:hideMark/>
+          </w:tcPr>
+          <w:p>
+            <w:pPr>
+              <w:bidi/>
+              <w:spacing w:after="160" w:line="278" w:lineRule="auto"/>
+              <w:cnfStyle w:val="000000100000" w:firstRow="0" w:lastRow="0" w:firstColumn="0" w:lastColumn="0" w:oddVBand="0" w:evenVBand="0" w:oddHBand="1" w:evenHBand="0" w:firstRowFirstColumn="0" w:firstRowLastColumn="0" w:lastRowFirstColumn="0" w:lastRowLastColumn="0"/>
+            </w:pPr>
+            <w:r>
+              <w:rPr>
+                <w:rFonts w:ascii="Segoe UI Emoji" w:hAnsi="Segoe UI Emoji" w:cs="Segoe UI Emoji"/>
+              </w:rPr>
+              <w:t>✅</w:t>
+            </w:r>
+            <w:r>
+              <w:t xml:space="preserve"> </w:t>
+            </w:r>
+            <w:r>
+              <w:rPr>
+                <w:rtl/>
+                <w:lang w:bidi="fa-IR"/>
+              </w:rPr>
+              <w:t>کامل</w:t>
+            </w:r>
+          </w:p>
+        </w:tc>
+        <w:tc>
+          <w:tcPr>
+            <w:tcW w:w="0" w:type="auto"/>
+            <w:hideMark/>
+          </w:tcPr>
+          <w:p>
+            <w:pPr>
+              <w:bidi/>
+              <w:spacing w:after="160" w:line="278" w:lineRule="auto"/>
+              <w:cnfStyle w:val="000000100000" w:firstRow="0" w:lastRow="0" w:firstColumn="0" w:lastColumn="0" w:oddVBand="0" w:evenVBand="0" w:oddHBand="1" w:evenHBand="0" w:firstRowFirstColumn="0" w:firstRowLastColumn="0" w:lastRowFirstColumn="0" w:lastRowLastColumn="0"/>
+            </w:pPr>
+            <w:proofErr w:type="spellStart"/>
+            <w:r>
+              <w:rPr>
+                <w:rtl/>
+                <w:lang w:bidi="fa-IR"/>
+              </w:rPr>
+              <w:t>مالیات‌ها</w:t>
+            </w:r>
+            <w:proofErr w:type="spellEnd"/>
+          </w:p>
+        </w:tc>
+      </w:tr>
+      <w:tr>
+        <w:trPr>
+          <w:jc w:val="center"/>
+        </w:trPr>
+        <w:tc>
+          <w:tcPr>
+            <w:cnfStyle w:val="001000000000" w:firstRow="0" w:lastRow="0" w:firstColumn="1" w:lastColumn="0" w:oddVBand="0" w:evenVBand="0" w:oddHBand="0" w:evenHBand="0" w:firstRowFirstColumn="0" w:firstRowLastColumn="0" w:lastRowFirstColumn="0" w:lastRowLastColumn="0"/>
+            <w:tcW w:w="0" w:type="auto"/>
+            <w:hideMark/>
+          </w:tcPr>
+          <w:p>
+            <w:pPr>
+              <w:bidi/>
+              <w:spacing w:after="160" w:line="278" w:lineRule="auto"/>
+            </w:pPr>
+            <w:proofErr w:type="spellStart"/>
+            <w:r>
+              <w:t>service_requirements</w:t>
+            </w:r>
+            <w:proofErr w:type="spellEnd"/>
+          </w:p>
+        </w:tc>
+        <w:tc>
+          <w:tcPr>
+            <w:tcW w:w="0" w:type="auto"/>
+            <w:hideMark/>
+          </w:tcPr>
+          <w:p>
+            <w:pPr>
+              <w:bidi/>
+              <w:spacing w:after="160" w:line="278" w:lineRule="auto"/>
+              <w:cnfStyle w:val="000000000000" w:firstRow="0" w:lastRow="0" w:firstColumn="0" w:lastColumn="0" w:oddVBand="0" w:evenVBand="0" w:oddHBand="0" w:evenHBand="0" w:firstRowFirstColumn="0" w:firstRowLastColumn="0" w:lastRowFirstColumn="0" w:lastRowLastColumn="0"/>
+            </w:pPr>
+            <w:r>
+              <w:rPr>
+                <w:rFonts w:ascii="Segoe UI Emoji" w:hAnsi="Segoe UI Emoji" w:cs="Segoe UI Emoji"/>
+              </w:rPr>
+              <w:t>✅</w:t>
+            </w:r>
+            <w:r>
+              <w:t xml:space="preserve"> </w:t>
+            </w:r>
+            <w:r>
+              <w:rPr>
+                <w:rtl/>
+                <w:lang w:bidi="fa-IR"/>
+              </w:rPr>
+              <w:t>کامل</w:t>
+            </w:r>
+          </w:p>
+        </w:tc>
+        <w:tc>
+          <w:tcPr>
+            <w:tcW w:w="0" w:type="auto"/>
+            <w:hideMark/>
+          </w:tcPr>
+          <w:p>
+            <w:pPr>
+              <w:bidi/>
+              <w:spacing w:after="160" w:line="278" w:lineRule="auto"/>
+              <w:cnfStyle w:val="000000000000" w:firstRow="0" w:lastRow="0" w:firstColumn="0" w:lastColumn="0" w:oddVBand="0" w:evenVBand="0" w:oddHBand="0" w:evenHBand="0" w:firstRowFirstColumn="0" w:firstRowLastColumn="0" w:lastRowFirstColumn="0" w:lastRowLastColumn="0"/>
+            </w:pPr>
+            <w:proofErr w:type="spellStart"/>
+            <w:r>
+              <w:rPr>
+                <w:rtl/>
+                <w:lang w:bidi="fa-IR"/>
+              </w:rPr>
+              <w:t>نیازمندی‌های</w:t>
+            </w:r>
+            <w:proofErr w:type="spellEnd"/>
+            <w:r>
+              <w:rPr>
+                <w:rtl/>
+                <w:lang w:bidi="fa-IR"/>
+              </w:rPr>
+              <w:t xml:space="preserve"> خدمات</w:t>
+            </w:r>
+          </w:p>
+        </w:tc>
+      </w:tr>
+      <w:tr>
+        <w:trPr>
+          <w:cnfStyle w:val="000000100000" w:firstRow="0" w:lastRow="0" w:firstColumn="0" w:lastColumn="0" w:oddVBand="0" w:evenVBand="0" w:oddHBand="1" w:evenHBand="0" w:firstRowFirstColumn="0" w:firstRowLastColumn="0" w:lastRowFirstColumn="0" w:lastRowLastColumn="0"/>
+          <w:jc w:val="center"/>
+        </w:trPr>
+        <w:tc>
+          <w:tcPr>
+            <w:cnfStyle w:val="001000000000" w:firstRow="0" w:lastRow="0" w:firstColumn="1" w:lastColumn="0" w:oddVBand="0" w:evenVBand="0" w:oddHBand="0" w:evenHBand="0" w:firstRowFirstColumn="0" w:firstRowLastColumn="0" w:lastRowFirstColumn="0" w:lastRowLastColumn="0"/>
+            <w:tcW w:w="0" w:type="auto"/>
+            <w:hideMark/>
+          </w:tcPr>
+          <w:p>
+            <w:pPr>
+              <w:bidi/>
+              <w:spacing w:after="160" w:line="278" w:lineRule="auto"/>
+            </w:pPr>
+            <w:r>
+              <w:t>expenses</w:t>
+            </w:r>
+          </w:p>
+        </w:tc>
+        <w:tc>
+          <w:tcPr>
+            <w:tcW w:w="0" w:type="auto"/>
+            <w:hideMark/>
+          </w:tcPr>
+          <w:p>
+            <w:pPr>
+              <w:bidi/>
+              <w:spacing w:after="160" w:line="278" w:lineRule="auto"/>
+              <w:cnfStyle w:val="000000100000" w:firstRow="0" w:lastRow="0" w:firstColumn="0" w:lastColumn="0" w:oddVBand="0" w:evenVBand="0" w:oddHBand="1" w:evenHBand="0" w:firstRowFirstColumn="0" w:firstRowLastColumn="0" w:lastRowFirstColumn="0" w:lastRowLastColumn="0"/>
+            </w:pPr>
+            <w:r>
+              <w:rPr>
+                <w:rFonts w:ascii="Segoe UI Emoji" w:hAnsi="Segoe UI Emoji" w:cs="Segoe UI Emoji"/>
+              </w:rPr>
+              <w:t>✅</w:t>
+            </w:r>
+            <w:r>
+              <w:t xml:space="preserve"> </w:t>
+            </w:r>
+            <w:r>
+              <w:rPr>
+                <w:rtl/>
+                <w:lang w:bidi="fa-IR"/>
+              </w:rPr>
+              <w:t>کامل</w:t>
+            </w:r>
+          </w:p>
+        </w:tc>
+        <w:tc>
+          <w:tcPr>
+            <w:tcW w:w="0" w:type="auto"/>
+            <w:hideMark/>
+          </w:tcPr>
+          <w:p>
+            <w:pPr>
+              <w:bidi/>
+              <w:spacing w:after="160" w:line="278" w:lineRule="auto"/>
+              <w:cnfStyle w:val="000000100000" w:firstRow="0" w:lastRow="0" w:firstColumn="0" w:lastColumn="0" w:oddVBand="0" w:evenVBand="0" w:oddHBand="1" w:evenHBand="0" w:firstRowFirstColumn="0" w:firstRowLastColumn="0" w:lastRowFirstColumn="0" w:lastRowLastColumn="0"/>
+            </w:pPr>
+            <w:proofErr w:type="spellStart"/>
+            <w:r>
+              <w:rPr>
+                <w:rtl/>
+                <w:lang w:bidi="fa-IR"/>
+              </w:rPr>
+              <w:t>هزینه‌ها</w:t>
+            </w:r>
+            <w:proofErr w:type="spellEnd"/>
+          </w:p>
+        </w:tc>
+      </w:tr>
+      <w:tr>
+        <w:trPr>
+          <w:jc w:val="center"/>
+        </w:trPr>
+        <w:tc>
+          <w:tcPr>
+            <w:cnfStyle w:val="001000000000" w:firstRow="0" w:lastRow="0" w:firstColumn="1" w:lastColumn="0" w:oddVBand="0" w:evenVBand="0" w:oddHBand="0" w:evenHBand="0" w:firstRowFirstColumn="0" w:firstRowLastColumn="0" w:lastRowFirstColumn="0" w:lastRowLastColumn="0"/>
+            <w:tcW w:w="0" w:type="auto"/>
+            <w:hideMark/>
+          </w:tcPr>
+          <w:p>
+            <w:pPr>
+              <w:bidi/>
+              <w:spacing w:after="160" w:line="278" w:lineRule="auto"/>
+            </w:pPr>
+            <w:proofErr w:type="spellStart"/>
+            <w:r>
+              <w:t>expense_invoices</w:t>
+            </w:r>
+            <w:proofErr w:type="spellEnd"/>
+          </w:p>
+        </w:tc>
+        <w:tc>
+          <w:tcPr>
+            <w:tcW w:w="0" w:type="auto"/>
+            <w:hideMark/>
+          </w:tcPr>
+          <w:p>
+            <w:pPr>
+              <w:bidi/>
+              <w:spacing w:after="160" w:line="278" w:lineRule="auto"/>
+              <w:cnfStyle w:val="000000000000" w:firstRow="0" w:lastRow="0" w:firstColumn="0" w:lastColumn="0" w:oddVBand="0" w:evenVBand="0" w:oddHBand="0" w:evenHBand="0" w:firstRowFirstColumn="0" w:firstRowLastColumn="0" w:lastRowFirstColumn="0" w:lastRowLastColumn="0"/>
+            </w:pPr>
+            <w:r>
+              <w:rPr>
+                <w:rFonts w:ascii="Segoe UI Emoji" w:hAnsi="Segoe UI Emoji" w:cs="Segoe UI Emoji"/>
+              </w:rPr>
+              <w:t>✅</w:t>
+            </w:r>
+            <w:r>
+              <w:t xml:space="preserve"> </w:t>
+            </w:r>
+            <w:r>
+              <w:rPr>
+                <w:rtl/>
+                <w:lang w:bidi="fa-IR"/>
+              </w:rPr>
+              <w:t>کامل</w:t>
+            </w:r>
+          </w:p>
+        </w:tc>
+        <w:tc>
+          <w:tcPr>
+            <w:tcW w:w="0" w:type="auto"/>
+            <w:hideMark/>
+          </w:tcPr>
+          <w:p>
+            <w:pPr>
+              <w:bidi/>
+              <w:spacing w:after="160" w:line="278" w:lineRule="auto"/>
+              <w:cnfStyle w:val="000000000000" w:firstRow="0" w:lastRow="0" w:firstColumn="0" w:lastColumn="0" w:oddVBand="0" w:evenVBand="0" w:oddHBand="0" w:evenHBand="0" w:firstRowFirstColumn="0" w:firstRowLastColumn="0" w:lastRowFirstColumn="0" w:lastRowLastColumn="0"/>
+            </w:pPr>
+            <w:r>
+              <w:rPr>
+                <w:rtl/>
+                <w:lang w:bidi="fa-IR"/>
+              </w:rPr>
+              <w:t>فاکتورها</w:t>
+            </w:r>
+          </w:p>
+        </w:tc>
+      </w:tr>
+    </w:tbl>
+    <w:p>
+      <w:pPr>
+        <w:bidi/>
+      </w:pPr>
+      <w:r>
+        <w:pict w14:anchorId="6117EE2A">
+          <v:rect id="_x0000_i1049" style="width:0;height:1.5pt" o:hralign="center" o:hrstd="t" o:hr="t" fillcolor="#a0a0a0" stroked="f"/>
+        </w:pict>
+      </w:r>
+    </w:p>
+    <w:p>
+      <w:pPr>
+        <w:bidi/>
+        <w:rPr>
+          <w:b/>
+          <w:bCs/>
+        </w:rPr>
+      </w:pPr>
+      <w:r>
+        <w:rPr>
+          <w:rFonts w:ascii="Segoe UI Emoji" w:hAnsi="Segoe UI Emoji" w:cs="Segoe UI Emoji"/>
+          <w:b/>
+          <w:bCs/>
+        </w:rPr>
+        <w:t>⚡</w:t>
+      </w:r>
+      <w:r>
+        <w:rPr>
+          <w:b/>
+          <w:bCs/>
+        </w:rPr>
+        <w:t xml:space="preserve"> CRUD </w:t>
+      </w:r>
+      <w:r>
+        <w:rPr>
+          <w:b/>
+          <w:bCs/>
+          <w:rtl/>
+          <w:lang w:bidi="fa-IR"/>
+        </w:rPr>
+        <w:t>محدود / فقط بعضی عملیات</w:t>
+      </w:r>
+    </w:p>
+    <w:tbl>
+      <w:tblPr>
+        <w:tblStyle w:val="GridTable4-Accent2"/>
+        <w:tblW w:w="0" w:type="auto"/>
+        <w:tblLook w:val="04A0" w:firstRow="1" w:lastRow="0" w:firstColumn="1" w:lastColumn="0" w:noHBand="0" w:noVBand="1"/>
+      </w:tblPr>
+      <w:tblGrid>
+        <w:gridCol w:w="2018"/>
+        <w:gridCol w:w="2491"/>
+        <w:gridCol w:w="4222"/>
+      </w:tblGrid>
+      <w:tr>
+        <w:trPr>
+          <w:cnfStyle w:val="100000000000" w:firstRow="1" w:lastRow="0" w:firstColumn="0" w:lastColumn="0" w:oddVBand="0" w:evenVBand="0" w:oddHBand="0" w:evenHBand="0" w:firstRowFirstColumn="0" w:firstRowLastColumn="0" w:lastRowFirstColumn="0" w:lastRowLastColumn="0"/>
+        </w:trPr>
+        <w:tc>
+          <w:tcPr>
+            <w:cnfStyle w:val="001000000000" w:firstRow="0" w:lastRow="0" w:firstColumn="1" w:lastColumn="0" w:oddVBand="0" w:evenVBand="0" w:oddHBand="0" w:evenHBand="0" w:firstRowFirstColumn="0" w:firstRowLastColumn="0" w:lastRowFirstColumn="0" w:lastRowLastColumn="0"/>
+            <w:tcW w:w="0" w:type="auto"/>
+            <w:hideMark/>
+          </w:tcPr>
+          <w:p>
+            <w:pPr>
+              <w:bidi/>
+              <w:spacing w:after="160" w:line="278" w:lineRule="auto"/>
+            </w:pPr>
+            <w:r>
+              <w:t>Table</w:t>
+            </w:r>
+          </w:p>
+        </w:tc>
+        <w:tc>
+          <w:tcPr>
+            <w:tcW w:w="0" w:type="auto"/>
+            <w:hideMark/>
+          </w:tcPr>
+          <w:p>
+            <w:pPr>
+              <w:bidi/>
+              <w:spacing w:after="160" w:line="278" w:lineRule="auto"/>
+              <w:cnfStyle w:val="100000000000" w:firstRow="1" w:lastRow="0" w:firstColumn="0" w:lastColumn="0" w:oddVBand="0" w:evenVBand="0" w:oddHBand="0" w:evenHBand="0" w:firstRowFirstColumn="0" w:firstRowLastColumn="0" w:lastRowFirstColumn="0" w:lastRowLastColumn="0"/>
+            </w:pPr>
+            <w:r>
+              <w:rPr>
+                <w:rtl/>
+                <w:lang w:bidi="fa-IR"/>
+              </w:rPr>
+              <w:t>عملیات</w:t>
+            </w:r>
+          </w:p>
+        </w:tc>
+        <w:tc>
+          <w:tcPr>
+            <w:tcW w:w="0" w:type="auto"/>
+            <w:hideMark/>
+          </w:tcPr>
+          <w:p>
+            <w:pPr>
+              <w:bidi/>
+              <w:spacing w:after="160" w:line="278" w:lineRule="auto"/>
+              <w:cnfStyle w:val="100000000000" w:firstRow="1" w:lastRow="0" w:firstColumn="0" w:lastColumn="0" w:oddVBand="0" w:evenVBand="0" w:oddHBand="0" w:evenHBand="0" w:firstRowFirstColumn="0" w:firstRowLastColumn="0" w:lastRowFirstColumn="0" w:lastRowLastColumn="0"/>
+            </w:pPr>
+            <w:r>
+              <w:rPr>
+                <w:rtl/>
+                <w:lang w:bidi="fa-IR"/>
+              </w:rPr>
+              <w:t>دلیل</w:t>
+            </w:r>
+          </w:p>
+        </w:tc>
+      </w:tr>
+      <w:tr>
+        <w:trPr>
+          <w:cnfStyle w:val="000000100000" w:firstRow="0" w:lastRow="0" w:firstColumn="0" w:lastColumn="0" w:oddVBand="0" w:evenVBand="0" w:oddHBand="1" w:evenHBand="0" w:firstRowFirstColumn="0" w:firstRowLastColumn="0" w:lastRowFirstColumn="0" w:lastRowLastColumn="0"/>
+        </w:trPr>
+        <w:tc>
+          <w:tcPr>
+            <w:cnfStyle w:val="001000000000" w:firstRow="0" w:lastRow="0" w:firstColumn="1" w:lastColumn="0" w:oddVBand="0" w:evenVBand="0" w:oddHBand="0" w:evenHBand="0" w:firstRowFirstColumn="0" w:firstRowLastColumn="0" w:lastRowFirstColumn="0" w:lastRowLastColumn="0"/>
+            <w:tcW w:w="0" w:type="auto"/>
+            <w:hideMark/>
+          </w:tcPr>
+          <w:p>
+            <w:pPr>
+              <w:bidi/>
+              <w:spacing w:after="160" w:line="278" w:lineRule="auto"/>
+            </w:pPr>
+            <w:r>
+              <w:t>appointments</w:t>
+            </w:r>
+          </w:p>
+        </w:tc>
+        <w:tc>
+          <w:tcPr>
+            <w:tcW w:w="0" w:type="auto"/>
+            <w:hideMark/>
+          </w:tcPr>
+          <w:p>
+            <w:pPr>
+              <w:bidi/>
+              <w:spacing w:after="160" w:line="278" w:lineRule="auto"/>
+              <w:cnfStyle w:val="000000100000" w:firstRow="0" w:lastRow="0" w:firstColumn="0" w:lastColumn="0" w:oddVBand="0" w:evenVBand="0" w:oddHBand="1" w:evenHBand="0" w:firstRowFirstColumn="0" w:firstRowLastColumn="0" w:lastRowFirstColumn="0" w:lastRowLastColumn="0"/>
+            </w:pPr>
+            <w:r>
+              <w:t>Create, Update, Cancel</w:t>
+            </w:r>
+          </w:p>
+        </w:tc>
+        <w:tc>
+          <w:tcPr>
+            <w:tcW w:w="0" w:type="auto"/>
+            <w:hideMark/>
+          </w:tcPr>
+          <w:p>
+            <w:pPr>
+              <w:bidi/>
+              <w:spacing w:after="160" w:line="278" w:lineRule="auto"/>
+              <w:cnfStyle w:val="000000100000" w:firstRow="0" w:lastRow="0" w:firstColumn="0" w:lastColumn="0" w:oddVBand="0" w:evenVBand="0" w:oddHBand="1" w:evenHBand="0" w:firstRowFirstColumn="0" w:firstRowLastColumn="0" w:lastRowFirstColumn="0" w:lastRowLastColumn="0"/>
+            </w:pPr>
+            <w:r>
+              <w:rPr>
+                <w:rtl/>
+                <w:lang w:bidi="fa-IR"/>
+              </w:rPr>
+              <w:t>معمولاً</w:t>
+            </w:r>
+            <w:r>
+              <w:t xml:space="preserve"> Delete </w:t>
+            </w:r>
+            <w:proofErr w:type="spellStart"/>
+            <w:r>
+              <w:rPr>
+                <w:rtl/>
+                <w:lang w:bidi="fa-IR"/>
+              </w:rPr>
+              <w:t>نمی‌شود</w:t>
+            </w:r>
+            <w:proofErr w:type="spellEnd"/>
+          </w:p>
+        </w:tc>
+      </w:tr>
+      <w:tr>
+        <w:tc>
+          <w:tcPr>
+            <w:cnfStyle w:val="001000000000" w:firstRow="0" w:lastRow="0" w:firstColumn="1" w:lastColumn="0" w:oddVBand="0" w:evenVBand="0" w:oddHBand="0" w:evenHBand="0" w:firstRowFirstColumn="0" w:firstRowLastColumn="0" w:lastRowFirstColumn="0" w:lastRowLastColumn="0"/>
+            <w:tcW w:w="0" w:type="auto"/>
+            <w:hideMark/>
+          </w:tcPr>
+          <w:p>
+            <w:pPr>
+              <w:bidi/>
+              <w:spacing w:after="160" w:line="278" w:lineRule="auto"/>
+            </w:pPr>
+            <w:proofErr w:type="spellStart"/>
+            <w:r>
+              <w:t>treatment_plans</w:t>
+            </w:r>
+            <w:proofErr w:type="spellEnd"/>
+          </w:p>
+        </w:tc>
+        <w:tc>
+          <w:tcPr>
+            <w:tcW w:w="0" w:type="auto"/>
+            <w:hideMark/>
+          </w:tcPr>
+          <w:p>
+            <w:pPr>
+              <w:bidi/>
+              <w:spacing w:after="160" w:line="278" w:lineRule="auto"/>
+              <w:cnfStyle w:val="000000000000" w:firstRow="0" w:lastRow="0" w:firstColumn="0" w:lastColumn="0" w:oddVBand="0" w:evenVBand="0" w:oddHBand="0" w:evenHBand="0" w:firstRowFirstColumn="0" w:firstRowLastColumn="0" w:lastRowFirstColumn="0" w:lastRowLastColumn="0"/>
+            </w:pPr>
+            <w:r>
+              <w:t>Create, Update, View</w:t>
+            </w:r>
+          </w:p>
+        </w:tc>
+        <w:tc>
+          <w:tcPr>
+            <w:tcW w:w="0" w:type="auto"/>
+            <w:hideMark/>
+          </w:tcPr>
+          <w:p>
+            <w:pPr>
+              <w:bidi/>
+              <w:spacing w:after="160" w:line="278" w:lineRule="auto"/>
+              <w:cnfStyle w:val="000000000000" w:firstRow="0" w:lastRow="0" w:firstColumn="0" w:lastColumn="0" w:oddVBand="0" w:evenVBand="0" w:oddHBand="0" w:evenHBand="0" w:firstRowFirstColumn="0" w:firstRowLastColumn="0" w:lastRowFirstColumn="0" w:lastRowLastColumn="0"/>
+            </w:pPr>
+            <w:r>
+              <w:rPr>
+                <w:rtl/>
+                <w:lang w:bidi="fa-IR"/>
+              </w:rPr>
+              <w:t>بعد از شروع درمان تاریخچه است</w:t>
+            </w:r>
+          </w:p>
+        </w:tc>
+      </w:tr>
+      <w:tr>
+        <w:trPr>
+          <w:cnfStyle w:val="000000100000" w:firstRow="0" w:lastRow="0" w:firstColumn="0" w:lastColumn="0" w:oddVBand="0" w:evenVBand="0" w:oddHBand="1" w:evenHBand="0" w:firstRowFirstColumn="0" w:firstRowLastColumn="0" w:lastRowFirstColumn="0" w:lastRowLastColumn="0"/>
+        </w:trPr>
+        <w:tc>
+          <w:tcPr>
+            <w:cnfStyle w:val="001000000000" w:firstRow="0" w:lastRow="0" w:firstColumn="1" w:lastColumn="0" w:oddVBand="0" w:evenVBand="0" w:oddHBand="0" w:evenHBand="0" w:firstRowFirstColumn="0" w:firstRowLastColumn="0" w:lastRowFirstColumn="0" w:lastRowLastColumn="0"/>
+            <w:tcW w:w="0" w:type="auto"/>
+            <w:hideMark/>
+          </w:tcPr>
+          <w:p>
+            <w:pPr>
+              <w:bidi/>
+              <w:spacing w:after="160" w:line="278" w:lineRule="auto"/>
+            </w:pPr>
+            <w:proofErr w:type="spellStart"/>
+            <w:r>
+              <w:t>fee_payments</w:t>
+            </w:r>
+            <w:proofErr w:type="spellEnd"/>
+          </w:p>
+        </w:tc>
+        <w:tc>
+          <w:tcPr>
+            <w:tcW w:w="0" w:type="auto"/>
+            <w:hideMark/>
+          </w:tcPr>
+          <w:p>
+            <w:pPr>
+              <w:bidi/>
+              <w:spacing w:after="160" w:line="278" w:lineRule="auto"/>
+              <w:cnfStyle w:val="000000100000" w:firstRow="0" w:lastRow="0" w:firstColumn="0" w:lastColumn="0" w:oddVBand="0" w:evenVBand="0" w:oddHBand="1" w:evenHBand="0" w:firstRowFirstColumn="0" w:firstRowLastColumn="0" w:lastRowFirstColumn="0" w:lastRowLastColumn="0"/>
+            </w:pPr>
+            <w:r>
+              <w:t>Create, View</w:t>
+            </w:r>
+          </w:p>
+        </w:tc>
+        <w:tc>
+          <w:tcPr>
+            <w:tcW w:w="0" w:type="auto"/>
+            <w:hideMark/>
+          </w:tcPr>
+          <w:p>
+            <w:pPr>
+              <w:bidi/>
+              <w:spacing w:after="160" w:line="278" w:lineRule="auto"/>
+              <w:cnfStyle w:val="000000100000" w:firstRow="0" w:lastRow="0" w:firstColumn="0" w:lastColumn="0" w:oddVBand="0" w:evenVBand="0" w:oddHBand="1" w:evenHBand="0" w:firstRowFirstColumn="0" w:firstRowLastColumn="0" w:lastRowFirstColumn="0" w:lastRowLastColumn="0"/>
+            </w:pPr>
+            <w:r>
+              <w:rPr>
+                <w:rtl/>
+                <w:lang w:bidi="fa-IR"/>
+              </w:rPr>
+              <w:t xml:space="preserve">پرداخت حذف </w:t>
+            </w:r>
+            <w:proofErr w:type="spellStart"/>
+            <w:r>
+              <w:rPr>
+                <w:rtl/>
+                <w:lang w:bidi="fa-IR"/>
+              </w:rPr>
+              <w:t>نمی‌شود</w:t>
+            </w:r>
+            <w:proofErr w:type="spellEnd"/>
+          </w:p>
+        </w:tc>
+      </w:tr>
+      <w:tr>
+        <w:tc>
+          <w:tcPr>
+            <w:cnfStyle w:val="001000000000" w:firstRow="0" w:lastRow="0" w:firstColumn="1" w:lastColumn="0" w:oddVBand="0" w:evenVBand="0" w:oddHBand="0" w:evenHBand="0" w:firstRowFirstColumn="0" w:firstRowLastColumn="0" w:lastRowFirstColumn="0" w:lastRowLastColumn="0"/>
+            <w:tcW w:w="0" w:type="auto"/>
+            <w:hideMark/>
+          </w:tcPr>
+          <w:p>
+            <w:pPr>
+              <w:bidi/>
+              <w:spacing w:after="160" w:line="278" w:lineRule="auto"/>
+            </w:pPr>
+            <w:proofErr w:type="spellStart"/>
+            <w:r>
+              <w:t>lab_cases</w:t>
+            </w:r>
+            <w:proofErr w:type="spellEnd"/>
+          </w:p>
+        </w:tc>
+        <w:tc>
+          <w:tcPr>
+            <w:tcW w:w="0" w:type="auto"/>
+            <w:hideMark/>
+          </w:tcPr>
+          <w:p>
+            <w:pPr>
+              <w:bidi/>
+              <w:spacing w:after="160" w:line="278" w:lineRule="auto"/>
+              <w:cnfStyle w:val="000000000000" w:firstRow="0" w:lastRow="0" w:firstColumn="0" w:lastColumn="0" w:oddVBand="0" w:evenVBand="0" w:oddHBand="0" w:evenHBand="0" w:firstRowFirstColumn="0" w:firstRowLastColumn="0" w:lastRowFirstColumn="0" w:lastRowLastColumn="0"/>
+            </w:pPr>
+            <w:r>
+              <w:t>Create, Update Status</w:t>
+            </w:r>
+          </w:p>
+        </w:tc>
+        <w:tc>
+          <w:tcPr>
+            <w:tcW w:w="0" w:type="auto"/>
+            <w:hideMark/>
+          </w:tcPr>
+          <w:p>
+            <w:pPr>
+              <w:bidi/>
+              <w:spacing w:after="160" w:line="278" w:lineRule="auto"/>
+              <w:cnfStyle w:val="000000000000" w:firstRow="0" w:lastRow="0" w:firstColumn="0" w:lastColumn="0" w:oddVBand="0" w:evenVBand="0" w:oddHBand="0" w:evenHBand="0" w:firstRowFirstColumn="0" w:firstRowLastColumn="0" w:lastRowFirstColumn="0" w:lastRowLastColumn="0"/>
+            </w:pPr>
+            <w:r>
+              <w:rPr>
+                <w:rtl/>
+                <w:lang w:bidi="fa-IR"/>
+              </w:rPr>
+              <w:t>وابسته به بیمار</w:t>
+            </w:r>
+          </w:p>
+        </w:tc>
+      </w:tr>
+      <w:tr>
+        <w:trPr>
+          <w:cnfStyle w:val="000000100000" w:firstRow="0" w:lastRow="0" w:firstColumn="0" w:lastColumn="0" w:oddVBand="0" w:evenVBand="0" w:oddHBand="1" w:evenHBand="0" w:firstRowFirstColumn="0" w:firstRowLastColumn="0" w:lastRowFirstColumn="0" w:lastRowLastColumn="0"/>
+        </w:trPr>
+        <w:tc>
+          <w:tcPr>
+            <w:cnfStyle w:val="001000000000" w:firstRow="0" w:lastRow="0" w:firstColumn="1" w:lastColumn="0" w:oddVBand="0" w:evenVBand="0" w:oddHBand="0" w:evenHBand="0" w:firstRowFirstColumn="0" w:firstRowLastColumn="0" w:lastRowFirstColumn="0" w:lastRowLastColumn="0"/>
+            <w:tcW w:w="0" w:type="auto"/>
+            <w:hideMark/>
+          </w:tcPr>
+          <w:p>
+            <w:pPr>
+              <w:bidi/>
+              <w:spacing w:after="160" w:line="278" w:lineRule="auto"/>
+            </w:pPr>
+            <w:proofErr w:type="spellStart"/>
+            <w:r>
+              <w:t>patient_xrays</w:t>
+            </w:r>
+            <w:proofErr w:type="spellEnd"/>
+          </w:p>
+        </w:tc>
+        <w:tc>
+          <w:tcPr>
+            <w:tcW w:w="0" w:type="auto"/>
+            <w:hideMark/>
+          </w:tcPr>
+          <w:p>
+            <w:pPr>
+              <w:bidi/>
+              <w:spacing w:after="160" w:line="278" w:lineRule="auto"/>
+              <w:cnfStyle w:val="000000100000" w:firstRow="0" w:lastRow="0" w:firstColumn="0" w:lastColumn="0" w:oddVBand="0" w:evenVBand="0" w:oddHBand="1" w:evenHBand="0" w:firstRowFirstColumn="0" w:firstRowLastColumn="0" w:lastRowFirstColumn="0" w:lastRowLastColumn="0"/>
+            </w:pPr>
+            <w:r>
+              <w:t>Upload, Delete, View</w:t>
+            </w:r>
+          </w:p>
+        </w:tc>
+        <w:tc>
+          <w:tcPr>
+            <w:tcW w:w="0" w:type="auto"/>
+            <w:hideMark/>
+          </w:tcPr>
+          <w:p>
+            <w:pPr>
+              <w:bidi/>
+              <w:spacing w:after="160" w:line="278" w:lineRule="auto"/>
+              <w:cnfStyle w:val="000000100000" w:firstRow="0" w:lastRow="0" w:firstColumn="0" w:lastColumn="0" w:oddVBand="0" w:evenVBand="0" w:oddHBand="1" w:evenHBand="0" w:firstRowFirstColumn="0" w:firstRowLastColumn="0" w:lastRowFirstColumn="0" w:lastRowLastColumn="0"/>
+            </w:pPr>
+            <w:r>
+              <w:rPr>
+                <w:rtl/>
+                <w:lang w:bidi="fa-IR"/>
+              </w:rPr>
+              <w:t>فایل محور</w:t>
+            </w:r>
+          </w:p>
+        </w:tc>
+      </w:tr>
+      <w:tr>
+        <w:tc>
+          <w:tcPr>
+            <w:cnfStyle w:val="001000000000" w:firstRow="0" w:lastRow="0" w:firstColumn="1" w:lastColumn="0" w:oddVBand="0" w:evenVBand="0" w:oddHBand="0" w:evenHBand="0" w:firstRowFirstColumn="0" w:firstRowLastColumn="0" w:lastRowFirstColumn="0" w:lastRowLastColumn="0"/>
+            <w:tcW w:w="0" w:type="auto"/>
+            <w:hideMark/>
+          </w:tcPr>
+          <w:p>
+            <w:pPr>
+              <w:bidi/>
+              <w:spacing w:after="160" w:line="278" w:lineRule="auto"/>
+            </w:pPr>
+            <w:proofErr w:type="spellStart"/>
+            <w:r>
+              <w:t>medicine_sales</w:t>
+            </w:r>
+            <w:proofErr w:type="spellEnd"/>
+          </w:p>
+        </w:tc>
+        <w:tc>
+          <w:tcPr>
+            <w:tcW w:w="0" w:type="auto"/>
+            <w:hideMark/>
+          </w:tcPr>
+          <w:p>
+            <w:pPr>
+              <w:bidi/>
+              <w:spacing w:after="160" w:line="278" w:lineRule="auto"/>
+              <w:cnfStyle w:val="000000000000" w:firstRow="0" w:lastRow="0" w:firstColumn="0" w:lastColumn="0" w:oddVBand="0" w:evenVBand="0" w:oddHBand="0" w:evenHBand="0" w:firstRowFirstColumn="0" w:firstRowLastColumn="0" w:lastRowFirstColumn="0" w:lastRowLastColumn="0"/>
+            </w:pPr>
+            <w:r>
+              <w:t>Create, View</w:t>
+            </w:r>
+          </w:p>
+        </w:tc>
+        <w:tc>
+          <w:tcPr>
+            <w:tcW w:w="0" w:type="auto"/>
+            <w:hideMark/>
+          </w:tcPr>
+          <w:p>
+            <w:pPr>
+              <w:bidi/>
+              <w:spacing w:after="160" w:line="278" w:lineRule="auto"/>
+              <w:cnfStyle w:val="000000000000" w:firstRow="0" w:lastRow="0" w:firstColumn="0" w:lastColumn="0" w:oddVBand="0" w:evenVBand="0" w:oddHBand="0" w:evenHBand="0" w:firstRowFirstColumn="0" w:firstRowLastColumn="0" w:lastRowFirstColumn="0" w:lastRowLastColumn="0"/>
+            </w:pPr>
+            <w:r>
+              <w:rPr>
+                <w:rtl/>
+                <w:lang w:bidi="fa-IR"/>
+              </w:rPr>
+              <w:t>فروش سند مالی است</w:t>
+            </w:r>
+          </w:p>
+        </w:tc>
+      </w:tr>
+      <w:tr>
+        <w:trPr>
+          <w:cnfStyle w:val="000000100000" w:firstRow="0" w:lastRow="0" w:firstColumn="0" w:lastColumn="0" w:oddVBand="0" w:evenVBand="0" w:oddHBand="1" w:evenHBand="0" w:firstRowFirstColumn="0" w:firstRowLastColumn="0" w:lastRowFirstColumn="0" w:lastRowLastColumn="0"/>
+        </w:trPr>
+        <w:tc>
+          <w:tcPr>
+            <w:cnfStyle w:val="001000000000" w:firstRow="0" w:lastRow="0" w:firstColumn="1" w:lastColumn="0" w:oddVBand="0" w:evenVBand="0" w:oddHBand="0" w:evenHBand="0" w:firstRowFirstColumn="0" w:firstRowLastColumn="0" w:lastRowFirstColumn="0" w:lastRowLastColumn="0"/>
+            <w:tcW w:w="0" w:type="auto"/>
+            <w:hideMark/>
+          </w:tcPr>
+          <w:p>
+            <w:pPr>
+              <w:bidi/>
+              <w:spacing w:after="160" w:line="278" w:lineRule="auto"/>
+            </w:pPr>
+            <w:proofErr w:type="spellStart"/>
+            <w:r>
+              <w:t>supplies_sales</w:t>
+            </w:r>
+            <w:proofErr w:type="spellEnd"/>
+          </w:p>
+        </w:tc>
+        <w:tc>
+          <w:tcPr>
+            <w:tcW w:w="0" w:type="auto"/>
+            <w:hideMark/>
+          </w:tcPr>
+          <w:p>
+            <w:pPr>
+              <w:bidi/>
+              <w:spacing w:after="160" w:line="278" w:lineRule="auto"/>
+              <w:cnfStyle w:val="000000100000" w:firstRow="0" w:lastRow="0" w:firstColumn="0" w:lastColumn="0" w:oddVBand="0" w:evenVBand="0" w:oddHBand="1" w:evenHBand="0" w:firstRowFirstColumn="0" w:firstRowLastColumn="0" w:lastRowFirstColumn="0" w:lastRowLastColumn="0"/>
+            </w:pPr>
+            <w:r>
+              <w:t>Create, View</w:t>
+            </w:r>
+          </w:p>
+        </w:tc>
+        <w:tc>
+          <w:tcPr>
+            <w:tcW w:w="0" w:type="auto"/>
+            <w:hideMark/>
+          </w:tcPr>
+          <w:p>
+            <w:pPr>
+              <w:bidi/>
+              <w:spacing w:after="160" w:line="278" w:lineRule="auto"/>
+              <w:cnfStyle w:val="000000100000" w:firstRow="0" w:lastRow="0" w:firstColumn="0" w:lastColumn="0" w:oddVBand="0" w:evenVBand="0" w:oddHBand="1" w:evenHBand="0" w:firstRowFirstColumn="0" w:firstRowLastColumn="0" w:lastRowFirstColumn="0" w:lastRowLastColumn="0"/>
+            </w:pPr>
+            <w:r>
+              <w:rPr>
+                <w:rtl/>
+                <w:lang w:bidi="fa-IR"/>
+              </w:rPr>
+              <w:t>خروجی انبار است</w:t>
+            </w:r>
+          </w:p>
+        </w:tc>
+      </w:tr>
+      <w:tr>
+        <w:tc>
+          <w:tcPr>
+            <w:cnfStyle w:val="001000000000" w:firstRow="0" w:lastRow="0" w:firstColumn="1" w:lastColumn="0" w:oddVBand="0" w:evenVBand="0" w:oddHBand="0" w:evenHBand="0" w:firstRowFirstColumn="0" w:firstRowLastColumn="0" w:lastRowFirstColumn="0" w:lastRowLastColumn="0"/>
+            <w:tcW w:w="0" w:type="auto"/>
+            <w:hideMark/>
+          </w:tcPr>
+          <w:p>
+            <w:pPr>
+              <w:bidi/>
+              <w:spacing w:after="160" w:line="278" w:lineRule="auto"/>
+            </w:pPr>
+            <w:proofErr w:type="spellStart"/>
+            <w:r>
+              <w:t>tax_payments</w:t>
+            </w:r>
+            <w:proofErr w:type="spellEnd"/>
+          </w:p>
+        </w:tc>
+        <w:tc>
+          <w:tcPr>
+            <w:tcW w:w="0" w:type="auto"/>
+            <w:hideMark/>
+          </w:tcPr>
+          <w:p>
+            <w:pPr>
+              <w:bidi/>
+              <w:spacing w:after="160" w:line="278" w:lineRule="auto"/>
+              <w:cnfStyle w:val="000000000000" w:firstRow="0" w:lastRow="0" w:firstColumn="0" w:lastColumn="0" w:oddVBand="0" w:evenVBand="0" w:oddHBand="0" w:evenHBand="0" w:firstRowFirstColumn="0" w:firstRowLastColumn="0" w:lastRowFirstColumn="0" w:lastRowLastColumn="0"/>
+            </w:pPr>
+            <w:r>
+              <w:t>Create, View</w:t>
+            </w:r>
+          </w:p>
+        </w:tc>
+        <w:tc>
+          <w:tcPr>
+            <w:tcW w:w="0" w:type="auto"/>
+            <w:hideMark/>
+          </w:tcPr>
+          <w:p>
+            <w:pPr>
+              <w:bidi/>
+              <w:spacing w:after="160" w:line="278" w:lineRule="auto"/>
+              <w:cnfStyle w:val="000000000000" w:firstRow="0" w:lastRow="0" w:firstColumn="0" w:lastColumn="0" w:oddVBand="0" w:evenVBand="0" w:oddHBand="0" w:evenHBand="0" w:firstRowFirstColumn="0" w:firstRowLastColumn="0" w:lastRowFirstColumn="0" w:lastRowLastColumn="0"/>
+            </w:pPr>
+            <w:r>
+              <w:rPr>
+                <w:rtl/>
+                <w:lang w:bidi="fa-IR"/>
+              </w:rPr>
+              <w:t>تراکنش مالی</w:t>
+            </w:r>
+          </w:p>
+        </w:tc>
+      </w:tr>
+    </w:tbl>
+    <w:p>
+      <w:pPr>
+        <w:bidi/>
+      </w:pPr>
+      <w:r>
+        <w:pict w14:anchorId="6E18B458">
+          <v:rect id="_x0000_i1050" style="width:0;height:1.5pt" o:hralign="center" o:hrstd="t" o:hr="t" fillcolor="#a0a0a0" stroked="f"/>
+        </w:pict>
+      </w:r>
+    </w:p>
+    <w:p>
+      <w:pPr>
+        <w:bidi/>
+        <w:rPr>
+          <w:b/>
+          <w:bCs/>
+        </w:rPr>
+      </w:pPr>
+      <w:r>
+        <w:rPr>
+          <w:rFonts w:ascii="Segoe UI Emoji" w:hAnsi="Segoe UI Emoji" w:cs="Segoe UI Emoji"/>
+          <w:b/>
+          <w:bCs/>
+        </w:rPr>
+        <w:lastRenderedPageBreak/>
+        <w:t>❌</w:t>
+      </w:r>
+      <w:r>
+        <w:rPr>
+          <w:b/>
+          <w:bCs/>
+        </w:rPr>
+        <w:t xml:space="preserve"> </w:t>
+      </w:r>
+      <w:proofErr w:type="spellStart"/>
+      <w:r>
+        <w:rPr>
+          <w:b/>
+          <w:bCs/>
+          <w:rtl/>
+          <w:lang w:bidi="fa-IR"/>
+        </w:rPr>
+        <w:t>جدول‌های</w:t>
+      </w:r>
+      <w:proofErr w:type="spellEnd"/>
+      <w:r>
+        <w:rPr>
+          <w:b/>
+          <w:bCs/>
+          <w:rtl/>
+          <w:lang w:bidi="fa-IR"/>
+        </w:rPr>
+        <w:t xml:space="preserve"> بدون</w:t>
+      </w:r>
+      <w:r>
+        <w:rPr>
+          <w:b/>
+          <w:bCs/>
+        </w:rPr>
+        <w:t xml:space="preserve"> CRUD </w:t>
+      </w:r>
+      <w:r>
+        <w:rPr>
+          <w:b/>
+          <w:bCs/>
+          <w:rtl/>
+          <w:lang w:bidi="fa-IR"/>
+        </w:rPr>
+        <w:t>مستقل</w:t>
+      </w:r>
+    </w:p>
+    <w:p>
+      <w:pPr>
+        <w:bidi/>
+      </w:pPr>
+      <w:proofErr w:type="spellStart"/>
+      <w:r>
+        <w:rPr>
+          <w:rtl/>
+          <w:lang w:bidi="fa-IR"/>
+        </w:rPr>
+        <w:t>این‌ها</w:t>
+      </w:r>
+      <w:proofErr w:type="spellEnd"/>
+      <w:r>
+        <w:rPr>
+          <w:rtl/>
+          <w:lang w:bidi="fa-IR"/>
+        </w:rPr>
+        <w:t xml:space="preserve"> جدول واسط یا</w:t>
+      </w:r>
+      <w:r>
+        <w:t xml:space="preserve"> Detail </w:t>
+      </w:r>
+      <w:r>
+        <w:rPr>
+          <w:rtl/>
+          <w:lang w:bidi="fa-IR"/>
+        </w:rPr>
+        <w:t>هستند</w:t>
+      </w:r>
+      <w:r>
+        <w:t>:</w:t>
+      </w:r>
+    </w:p>
+    <w:tbl>
+      <w:tblPr>
+        <w:tblStyle w:val="GridTable4-Accent2"/>
+        <w:tblW w:w="0" w:type="auto"/>
+        <w:jc w:val="center"/>
+        <w:tblLook w:val="04A0" w:firstRow="1" w:lastRow="0" w:firstColumn="1" w:lastColumn="0" w:noHBand="0" w:noVBand="1"/>
+      </w:tblPr>
+      <w:tblGrid>
+        <w:gridCol w:w="2108"/>
+        <w:gridCol w:w="2784"/>
+      </w:tblGrid>
+      <w:tr>
+        <w:trPr>
+          <w:cnfStyle w:val="100000000000" w:firstRow="1" w:lastRow="0" w:firstColumn="0" w:lastColumn="0" w:oddVBand="0" w:evenVBand="0" w:oddHBand="0" w:evenHBand="0" w:firstRowFirstColumn="0" w:firstRowLastColumn="0" w:lastRowFirstColumn="0" w:lastRowLastColumn="0"/>
+          <w:jc w:val="center"/>
+        </w:trPr>
+        <w:tc>
+          <w:tcPr>
+            <w:cnfStyle w:val="001000000000" w:firstRow="0" w:lastRow="0" w:firstColumn="1" w:lastColumn="0" w:oddVBand="0" w:evenVBand="0" w:oddHBand="0" w:evenHBand="0" w:firstRowFirstColumn="0" w:firstRowLastColumn="0" w:lastRowFirstColumn="0" w:lastRowLastColumn="0"/>
+            <w:tcW w:w="0" w:type="auto"/>
+            <w:hideMark/>
+          </w:tcPr>
+          <w:p>
+            <w:pPr>
+              <w:bidi/>
+              <w:spacing w:after="160" w:line="278" w:lineRule="auto"/>
+              <w:jc w:val="center"/>
+            </w:pPr>
+            <w:r>
+              <w:t>Table</w:t>
+            </w:r>
+          </w:p>
+        </w:tc>
+        <w:tc>
+          <w:tcPr>
+            <w:tcW w:w="0" w:type="auto"/>
+            <w:hideMark/>
+          </w:tcPr>
+          <w:p>
+            <w:pPr>
+              <w:bidi/>
+              <w:spacing w:after="160" w:line="278" w:lineRule="auto"/>
+              <w:cnfStyle w:val="100000000000" w:firstRow="1" w:lastRow="0" w:firstColumn="0" w:lastColumn="0" w:oddVBand="0" w:evenVBand="0" w:oddHBand="0" w:evenHBand="0" w:firstRowFirstColumn="0" w:firstRowLastColumn="0" w:lastRowFirstColumn="0" w:lastRowLastColumn="0"/>
+            </w:pPr>
+            <w:r>
+              <w:rPr>
+                <w:rtl/>
+                <w:lang w:bidi="fa-IR"/>
+              </w:rPr>
+              <w:t>مدیریت از طریق</w:t>
+            </w:r>
+          </w:p>
+        </w:tc>
+      </w:tr>
+      <w:tr>
+        <w:trPr>
+          <w:cnfStyle w:val="000000100000" w:firstRow="0" w:lastRow="0" w:firstColumn="0" w:lastColumn="0" w:oddVBand="0" w:evenVBand="0" w:oddHBand="1" w:evenHBand="0" w:firstRowFirstColumn="0" w:firstRowLastColumn="0" w:lastRowFirstColumn="0" w:lastRowLastColumn="0"/>
+          <w:jc w:val="center"/>
+        </w:trPr>
+        <w:tc>
+          <w:tcPr>
+            <w:cnfStyle w:val="001000000000" w:firstRow="0" w:lastRow="0" w:firstColumn="1" w:lastColumn="0" w:oddVBand="0" w:evenVBand="0" w:oddHBand="0" w:evenHBand="0" w:firstRowFirstColumn="0" w:firstRowLastColumn="0" w:lastRowFirstColumn="0" w:lastRowLastColumn="0"/>
+            <w:tcW w:w="0" w:type="auto"/>
+            <w:hideMark/>
+          </w:tcPr>
+          <w:p>
+            <w:pPr>
+              <w:bidi/>
+              <w:spacing w:after="160" w:line="278" w:lineRule="auto"/>
+            </w:pPr>
+            <w:proofErr w:type="spellStart"/>
+            <w:r>
+              <w:t>staff_auth</w:t>
+            </w:r>
+            <w:proofErr w:type="spellEnd"/>
+          </w:p>
+        </w:tc>
+        <w:tc>
+          <w:tcPr>
+            <w:tcW w:w="0" w:type="auto"/>
+            <w:hideMark/>
+          </w:tcPr>
+          <w:p>
+            <w:pPr>
+              <w:bidi/>
+              <w:spacing w:after="160" w:line="278" w:lineRule="auto"/>
+              <w:cnfStyle w:val="000000100000" w:firstRow="0" w:lastRow="0" w:firstColumn="0" w:lastColumn="0" w:oddVBand="0" w:evenVBand="0" w:oddHBand="1" w:evenHBand="0" w:firstRowFirstColumn="0" w:firstRowLastColumn="0" w:lastRowFirstColumn="0" w:lastRowLastColumn="0"/>
+            </w:pPr>
+            <w:r>
+              <w:t>Staff</w:t>
+            </w:r>
+          </w:p>
+        </w:tc>
+      </w:tr>
+      <w:tr>
+        <w:trPr>
+          <w:jc w:val="center"/>
+        </w:trPr>
+        <w:tc>
+          <w:tcPr>
+            <w:cnfStyle w:val="001000000000" w:firstRow="0" w:lastRow="0" w:firstColumn="1" w:lastColumn="0" w:oddVBand="0" w:evenVBand="0" w:oddHBand="0" w:evenHBand="0" w:firstRowFirstColumn="0" w:firstRowLastColumn="0" w:lastRowFirstColumn="0" w:lastRowLastColumn="0"/>
+            <w:tcW w:w="0" w:type="auto"/>
+            <w:hideMark/>
+          </w:tcPr>
+          <w:p>
+            <w:pPr>
+              <w:bidi/>
+              <w:spacing w:after="160" w:line="278" w:lineRule="auto"/>
+            </w:pPr>
+            <w:proofErr w:type="spellStart"/>
+            <w:r>
+              <w:t>patient_services</w:t>
+            </w:r>
+            <w:proofErr w:type="spellEnd"/>
+          </w:p>
+        </w:tc>
+        <w:tc>
+          <w:tcPr>
+            <w:tcW w:w="0" w:type="auto"/>
+            <w:hideMark/>
+          </w:tcPr>
+          <w:p>
+            <w:pPr>
+              <w:bidi/>
+              <w:spacing w:after="160" w:line="278" w:lineRule="auto"/>
+              <w:cnfStyle w:val="000000000000" w:firstRow="0" w:lastRow="0" w:firstColumn="0" w:lastColumn="0" w:oddVBand="0" w:evenVBand="0" w:oddHBand="0" w:evenHBand="0" w:firstRowFirstColumn="0" w:firstRowLastColumn="0" w:lastRowFirstColumn="0" w:lastRowLastColumn="0"/>
+              <w:rPr>
+                <w:rFonts w:hint="cs"/>
+                <w:rtl/>
+                <w:lang w:bidi="fa-IR"/>
+              </w:rPr>
+            </w:pPr>
+            <w:r>
+              <w:t>Treatment Plan</w:t>
+            </w:r>
+          </w:p>
+        </w:tc>
+      </w:tr>
+      <w:tr>
+        <w:trPr>
+          <w:cnfStyle w:val="000000100000" w:firstRow="0" w:lastRow="0" w:firstColumn="0" w:lastColumn="0" w:oddVBand="0" w:evenVBand="0" w:oddHBand="1" w:evenHBand="0" w:firstRowFirstColumn="0" w:firstRowLastColumn="0" w:lastRowFirstColumn="0" w:lastRowLastColumn="0"/>
+          <w:jc w:val="center"/>
+        </w:trPr>
+        <w:tc>
+          <w:tcPr>
+            <w:cnfStyle w:val="001000000000" w:firstRow="0" w:lastRow="0" w:firstColumn="1" w:lastColumn="0" w:oddVBand="0" w:evenVBand="0" w:oddHBand="0" w:evenHBand="0" w:firstRowFirstColumn="0" w:firstRowLastColumn="0" w:lastRowFirstColumn="0" w:lastRowLastColumn="0"/>
+            <w:tcW w:w="0" w:type="auto"/>
+            <w:hideMark/>
+          </w:tcPr>
+          <w:p>
+            <w:pPr>
+              <w:bidi/>
+              <w:spacing w:after="160" w:line="278" w:lineRule="auto"/>
+            </w:pPr>
+            <w:proofErr w:type="spellStart"/>
+            <w:r>
+              <w:t>plan_services</w:t>
+            </w:r>
+            <w:proofErr w:type="spellEnd"/>
+          </w:p>
+        </w:tc>
+        <w:tc>
+          <w:tcPr>
+            <w:tcW w:w="0" w:type="auto"/>
+            <w:hideMark/>
+          </w:tcPr>
+          <w:p>
+            <w:pPr>
+              <w:bidi/>
+              <w:spacing w:after="160" w:line="278" w:lineRule="auto"/>
+              <w:cnfStyle w:val="000000100000" w:firstRow="0" w:lastRow="0" w:firstColumn="0" w:lastColumn="0" w:oddVBand="0" w:evenVBand="0" w:oddHBand="1" w:evenHBand="0" w:firstRowFirstColumn="0" w:firstRowLastColumn="0" w:lastRowFirstColumn="0" w:lastRowLastColumn="0"/>
+            </w:pPr>
+            <w:r>
+              <w:t>Treatment Plan + Service</w:t>
+            </w:r>
+          </w:p>
+        </w:tc>
+      </w:tr>
+      <w:tr>
+        <w:trPr>
+          <w:jc w:val="center"/>
+        </w:trPr>
+        <w:tc>
+          <w:tcPr>
+            <w:cnfStyle w:val="001000000000" w:firstRow="0" w:lastRow="0" w:firstColumn="1" w:lastColumn="0" w:oddVBand="0" w:evenVBand="0" w:oddHBand="0" w:evenHBand="0" w:firstRowFirstColumn="0" w:firstRowLastColumn="0" w:lastRowFirstColumn="0" w:lastRowLastColumn="0"/>
+            <w:tcW w:w="0" w:type="auto"/>
+            <w:hideMark/>
+          </w:tcPr>
+          <w:p>
+            <w:pPr>
+              <w:bidi/>
+              <w:spacing w:after="160" w:line="278" w:lineRule="auto"/>
+            </w:pPr>
+            <w:proofErr w:type="spellStart"/>
+            <w:r>
+              <w:t>condition_details</w:t>
+            </w:r>
+            <w:proofErr w:type="spellEnd"/>
+          </w:p>
+        </w:tc>
+        <w:tc>
+          <w:tcPr>
+            <w:tcW w:w="0" w:type="auto"/>
+            <w:hideMark/>
+          </w:tcPr>
+          <w:p>
+            <w:pPr>
+              <w:bidi/>
+              <w:spacing w:after="160" w:line="278" w:lineRule="auto"/>
+              <w:cnfStyle w:val="000000000000" w:firstRow="0" w:lastRow="0" w:firstColumn="0" w:lastColumn="0" w:oddVBand="0" w:evenVBand="0" w:oddHBand="0" w:evenHBand="0" w:firstRowFirstColumn="0" w:firstRowLastColumn="0" w:lastRowFirstColumn="0" w:lastRowLastColumn="0"/>
+            </w:pPr>
+            <w:r>
+              <w:t>Conditions</w:t>
+            </w:r>
+          </w:p>
+        </w:tc>
+      </w:tr>
+      <w:tr>
+        <w:trPr>
+          <w:cnfStyle w:val="000000100000" w:firstRow="0" w:lastRow="0" w:firstColumn="0" w:lastColumn="0" w:oddVBand="0" w:evenVBand="0" w:oddHBand="1" w:evenHBand="0" w:firstRowFirstColumn="0" w:firstRowLastColumn="0" w:lastRowFirstColumn="0" w:lastRowLastColumn="0"/>
+          <w:jc w:val="center"/>
+        </w:trPr>
+        <w:tc>
+          <w:tcPr>
+            <w:cnfStyle w:val="001000000000" w:firstRow="0" w:lastRow="0" w:firstColumn="1" w:lastColumn="0" w:oddVBand="0" w:evenVBand="0" w:oddHBand="0" w:evenHBand="0" w:firstRowFirstColumn="0" w:firstRowLastColumn="0" w:lastRowFirstColumn="0" w:lastRowLastColumn="0"/>
+            <w:tcW w:w="0" w:type="auto"/>
+            <w:hideMark/>
+          </w:tcPr>
+          <w:p>
+            <w:pPr>
+              <w:bidi/>
+              <w:spacing w:after="160" w:line="278" w:lineRule="auto"/>
+            </w:pPr>
+            <w:proofErr w:type="spellStart"/>
+            <w:r>
+              <w:t>expense_detail</w:t>
+            </w:r>
+            <w:proofErr w:type="spellEnd"/>
+          </w:p>
+        </w:tc>
+        <w:tc>
+          <w:tcPr>
+            <w:tcW w:w="0" w:type="auto"/>
+            <w:hideMark/>
+          </w:tcPr>
+          <w:p>
+            <w:pPr>
+              <w:bidi/>
+              <w:spacing w:after="160" w:line="278" w:lineRule="auto"/>
+              <w:cnfStyle w:val="000000100000" w:firstRow="0" w:lastRow="0" w:firstColumn="0" w:lastColumn="0" w:oddVBand="0" w:evenVBand="0" w:oddHBand="1" w:evenHBand="0" w:firstRowFirstColumn="0" w:firstRowLastColumn="0" w:lastRowFirstColumn="0" w:lastRowLastColumn="0"/>
+            </w:pPr>
+            <w:r>
+              <w:t>Expense</w:t>
+            </w:r>
+          </w:p>
+        </w:tc>
+      </w:tr>
+      <w:tr>
+        <w:trPr>
+          <w:jc w:val="center"/>
+        </w:trPr>
+        <w:tc>
+          <w:tcPr>
+            <w:cnfStyle w:val="001000000000" w:firstRow="0" w:lastRow="0" w:firstColumn="1" w:lastColumn="0" w:oddVBand="0" w:evenVBand="0" w:oddHBand="0" w:evenHBand="0" w:firstRowFirstColumn="0" w:firstRowLastColumn="0" w:lastRowFirstColumn="0" w:lastRowLastColumn="0"/>
+            <w:tcW w:w="0" w:type="auto"/>
+            <w:hideMark/>
+          </w:tcPr>
+          <w:p>
+            <w:pPr>
+              <w:bidi/>
+              <w:spacing w:after="160" w:line="278" w:lineRule="auto"/>
+            </w:pPr>
+            <w:proofErr w:type="spellStart"/>
+            <w:r>
+              <w:t>lab_payments</w:t>
+            </w:r>
+            <w:proofErr w:type="spellEnd"/>
+          </w:p>
+        </w:tc>
+        <w:tc>
+          <w:tcPr>
+            <w:tcW w:w="0" w:type="auto"/>
+            <w:hideMark/>
+          </w:tcPr>
+          <w:p>
+            <w:pPr>
+              <w:bidi/>
+              <w:spacing w:after="160" w:line="278" w:lineRule="auto"/>
+              <w:cnfStyle w:val="000000000000" w:firstRow="0" w:lastRow="0" w:firstColumn="0" w:lastColumn="0" w:oddVBand="0" w:evenVBand="0" w:oddHBand="0" w:evenHBand="0" w:firstRowFirstColumn="0" w:firstRowLastColumn="0" w:lastRowFirstColumn="0" w:lastRowLastColumn="0"/>
+            </w:pPr>
+            <w:r>
+              <w:t>Lab Case</w:t>
+            </w:r>
+          </w:p>
+        </w:tc>
+      </w:tr>
+      <w:tr>
+        <w:trPr>
+          <w:cnfStyle w:val="000000100000" w:firstRow="0" w:lastRow="0" w:firstColumn="0" w:lastColumn="0" w:oddVBand="0" w:evenVBand="0" w:oddHBand="1" w:evenHBand="0" w:firstRowFirstColumn="0" w:firstRowLastColumn="0" w:lastRowFirstColumn="0" w:lastRowLastColumn="0"/>
+          <w:jc w:val="center"/>
+        </w:trPr>
+        <w:tc>
+          <w:tcPr>
+            <w:cnfStyle w:val="001000000000" w:firstRow="0" w:lastRow="0" w:firstColumn="1" w:lastColumn="0" w:oddVBand="0" w:evenVBand="0" w:oddHBand="0" w:evenHBand="0" w:firstRowFirstColumn="0" w:firstRowLastColumn="0" w:lastRowFirstColumn="0" w:lastRowLastColumn="0"/>
+            <w:tcW w:w="0" w:type="auto"/>
+            <w:hideMark/>
+          </w:tcPr>
+          <w:p>
+            <w:pPr>
+              <w:bidi/>
+              <w:spacing w:after="160" w:line="278" w:lineRule="auto"/>
+            </w:pPr>
+            <w:proofErr w:type="spellStart"/>
+            <w:r>
+              <w:t>class_revenues</w:t>
+            </w:r>
+            <w:proofErr w:type="spellEnd"/>
+          </w:p>
+        </w:tc>
+        <w:tc>
+          <w:tcPr>
+            <w:tcW w:w="0" w:type="auto"/>
+            <w:hideMark/>
+          </w:tcPr>
+          <w:p>
+            <w:pPr>
+              <w:bidi/>
+              <w:spacing w:after="160" w:line="278" w:lineRule="auto"/>
+              <w:cnfStyle w:val="000000100000" w:firstRow="0" w:lastRow="0" w:firstColumn="0" w:lastColumn="0" w:oddVBand="0" w:evenVBand="0" w:oddHBand="1" w:evenHBand="0" w:firstRowFirstColumn="0" w:firstRowLastColumn="0" w:lastRowFirstColumn="0" w:lastRowLastColumn="0"/>
+            </w:pPr>
+            <w:r>
+              <w:t>Finance / Reports</w:t>
+            </w:r>
+          </w:p>
+        </w:tc>
+      </w:tr>
+    </w:tbl>
+    <w:p>
+      <w:pPr>
+        <w:bidi/>
+      </w:pPr>
+      <w:r>
+        <w:pict w14:anchorId="44CB942C">
+          <v:rect id="_x0000_i1051" style="width:0;height:1.5pt" o:hralign="center" o:hrstd="t" o:hr="t" fillcolor="#a0a0a0" stroked="f"/>
+        </w:pict>
+      </w:r>
+    </w:p>
+    <w:p>
+      <w:pPr>
+        <w:bidi/>
+        <w:rPr>
+          <w:b/>
+          <w:bCs/>
+        </w:rPr>
+      </w:pPr>
+      <w:r>
+        <w:rPr>
+          <w:b/>
+          <w:bCs/>
+          <w:rtl/>
+          <w:lang w:bidi="fa-IR"/>
+        </w:rPr>
+        <w:t>ساختار</w:t>
+      </w:r>
+      <w:r>
+        <w:rPr>
+          <w:b/>
+          <w:bCs/>
+        </w:rPr>
+        <w:t xml:space="preserve"> UI </w:t>
+      </w:r>
+      <w:r>
+        <w:rPr>
+          <w:b/>
+          <w:bCs/>
+          <w:rtl/>
+          <w:lang w:bidi="fa-IR"/>
+        </w:rPr>
+        <w:t>پیشنهادی من برای</w:t>
+      </w:r>
+      <w:r>
+        <w:rPr>
+          <w:b/>
+          <w:bCs/>
+        </w:rPr>
+        <w:t xml:space="preserve"> DMS</w:t>
+      </w:r>
+    </w:p>
+    <w:p>
+      <w:pPr>
+        <w:rPr>
+          <w:b/>
+          <w:bCs/>
+        </w:rPr>
+      </w:pPr>
+      <w:r>
+        <w:rPr>
+          <w:b/>
+          <w:bCs/>
+        </w:rPr>
+        <w:t>Sidebar Menu:</w:t>
+      </w:r>
+    </w:p>
+    <w:p>
+      <w:r>
+        <w:t>Dashboard</w:t>
+      </w:r>
+    </w:p>
     <w:p/>
+    <w:p>
+      <w:r>
+        <w:t>Patients</w:t>
+      </w:r>
+    </w:p>
+    <w:p>
+      <w:r>
+        <w:t>Staff</w:t>
+      </w:r>
+    </w:p>
+    <w:p>
+      <w:r>
+        <w:t>Appointments</w:t>
+      </w:r>
+    </w:p>
+    <w:p/>
+    <w:p>
+      <w:r>
+        <w:t>Treatment</w:t>
+      </w:r>
+    </w:p>
+    <w:p>
+      <w:r>
+        <w:t xml:space="preserve"> ├── Treatment Plans</w:t>
+      </w:r>
+    </w:p>
+    <w:p>
+      <w:r>
+        <w:t xml:space="preserve"> ├── Services</w:t>
+      </w:r>
+    </w:p>
+    <w:p>
+      <w:r>
+        <w:t xml:space="preserve"> └── Conditions</w:t>
+      </w:r>
+    </w:p>
+    <w:p/>
+    <w:p>
+      <w:r>
+        <w:t>Laboratory</w:t>
+      </w:r>
+    </w:p>
+    <w:p>
+      <w:r>
+        <w:t xml:space="preserve"> ├── Labs</w:t>
+      </w:r>
+    </w:p>
+    <w:p>
+      <w:r>
+        <w:t xml:space="preserve"> └── Lab Cases</w:t>
+      </w:r>
+    </w:p>
+    <w:p/>
+    <w:p>
+      <w:r>
+        <w:t>Pharmacy</w:t>
+      </w:r>
+    </w:p>
+    <w:p>
+      <w:r>
+        <w:t xml:space="preserve"> ├── Medicines</w:t>
+      </w:r>
+    </w:p>
+    <w:p>
+      <w:r>
+        <w:t xml:space="preserve"> └── Sales</w:t>
+      </w:r>
+    </w:p>
+    <w:p/>
+    <w:p>
+      <w:r>
+        <w:t>Inventory</w:t>
+      </w:r>
+    </w:p>
+    <w:p>
+      <w:r>
+        <w:t xml:space="preserve"> └── Supplies</w:t>
+      </w:r>
+    </w:p>
+    <w:p/>
+    <w:p>
+      <w:r>
+        <w:t>Finance</w:t>
+      </w:r>
+    </w:p>
+    <w:p>
+      <w:r>
+        <w:t xml:space="preserve"> ├── Payments</w:t>
+      </w:r>
+    </w:p>
+    <w:p>
+      <w:r>
+        <w:t xml:space="preserve"> ├── Expenses</w:t>
+      </w:r>
+    </w:p>
+    <w:p>
+      <w:r>
+        <w:t xml:space="preserve"> ├── Taxes</w:t>
+      </w:r>
+    </w:p>
+    <w:p>
+      <w:r>
+        <w:t xml:space="preserve"> └── Reports</w:t>
+      </w:r>
+    </w:p>
+    <w:p/>
+    <w:p>
+      <w:r>
+        <w:t>Settings</w:t>
+      </w:r>
+    </w:p>
+    <w:p>
+      <w:pPr>
+        <w:bidi/>
+      </w:pPr>
+      <w:r>
+        <w:pict w14:anchorId="51002DBB">
+          <v:rect id="_x0000_i1052" style="width:0;height:1.5pt" o:hralign="center" o:hrstd="t" o:hr="t" fillcolor="#a0a0a0" stroked="f"/>
+        </w:pict>
+      </w:r>
+    </w:p>
+    <w:p>
+      <w:pPr>
+        <w:bidi/>
+      </w:pPr>
+      <w:r>
+        <w:rPr>
+          <w:rtl/>
+          <w:lang w:bidi="fa-IR"/>
+        </w:rPr>
+        <w:t>برای</w:t>
+      </w:r>
+      <w:r>
+        <w:t xml:space="preserve"> </w:t>
+      </w:r>
+      <w:proofErr w:type="spellStart"/>
+      <w:r>
+        <w:t>DataTable</w:t>
+      </w:r>
+      <w:proofErr w:type="spellEnd"/>
+      <w:r>
+        <w:t xml:space="preserve"> </w:t>
+      </w:r>
+      <w:proofErr w:type="spellStart"/>
+      <w:r>
+        <w:rPr>
+          <w:rtl/>
+          <w:lang w:bidi="fa-IR"/>
+        </w:rPr>
+        <w:t>هایی</w:t>
+      </w:r>
+      <w:proofErr w:type="spellEnd"/>
+      <w:r>
+        <w:rPr>
+          <w:rtl/>
+          <w:lang w:bidi="fa-IR"/>
+        </w:rPr>
+        <w:t xml:space="preserve"> که الان </w:t>
+      </w:r>
+      <w:proofErr w:type="spellStart"/>
+      <w:r>
+        <w:rPr>
+          <w:rtl/>
+          <w:lang w:bidi="fa-IR"/>
+        </w:rPr>
+        <w:t>می‌سازیم</w:t>
+      </w:r>
+      <w:proofErr w:type="spellEnd"/>
+      <w:r>
+        <w:rPr>
+          <w:rtl/>
+          <w:lang w:bidi="fa-IR"/>
+        </w:rPr>
+        <w:t xml:space="preserve">، اول </w:t>
+      </w:r>
+      <w:proofErr w:type="spellStart"/>
+      <w:r>
+        <w:rPr>
+          <w:rtl/>
+          <w:lang w:bidi="fa-IR"/>
+        </w:rPr>
+        <w:t>این‌ها</w:t>
+      </w:r>
+      <w:proofErr w:type="spellEnd"/>
+      <w:r>
+        <w:rPr>
+          <w:rtl/>
+          <w:lang w:bidi="fa-IR"/>
+        </w:rPr>
+        <w:t xml:space="preserve"> را بسازیم</w:t>
+      </w:r>
+      <w:r>
+        <w:t>:</w:t>
+      </w:r>
+    </w:p>
+    <w:p>
+      <w:pPr>
+        <w:numPr>
+          <w:ilvl w:val="0"/>
+          <w:numId w:val="1"/>
+        </w:numPr>
+      </w:pPr>
+      <w:r>
+        <w:rPr>
+          <w:rFonts w:ascii="Segoe UI Emoji" w:hAnsi="Segoe UI Emoji" w:cs="Segoe UI Emoji"/>
+        </w:rPr>
+        <w:t>✅</w:t>
+      </w:r>
+      <w:r>
+        <w:t xml:space="preserve"> Patients</w:t>
+      </w:r>
+    </w:p>
+    <w:p>
+      <w:pPr>
+        <w:numPr>
+          <w:ilvl w:val="0"/>
+          <w:numId w:val="1"/>
+        </w:numPr>
+      </w:pPr>
+      <w:r>
+        <w:rPr>
+          <w:rFonts w:ascii="Segoe UI Emoji" w:hAnsi="Segoe UI Emoji" w:cs="Segoe UI Emoji"/>
+        </w:rPr>
+        <w:t>✅</w:t>
+      </w:r>
+      <w:r>
+        <w:t xml:space="preserve"> Staff</w:t>
+      </w:r>
+    </w:p>
+    <w:p>
+      <w:pPr>
+        <w:numPr>
+          <w:ilvl w:val="0"/>
+          <w:numId w:val="1"/>
+        </w:numPr>
+      </w:pPr>
+      <w:r>
+        <w:rPr>
+          <w:rFonts w:ascii="Segoe UI Emoji" w:hAnsi="Segoe UI Emoji" w:cs="Segoe UI Emoji"/>
+        </w:rPr>
+        <w:t>✅</w:t>
+      </w:r>
+      <w:r>
+        <w:t xml:space="preserve"> Services</w:t>
+      </w:r>
+    </w:p>
+    <w:p>
+      <w:pPr>
+        <w:numPr>
+          <w:ilvl w:val="0"/>
+          <w:numId w:val="1"/>
+        </w:numPr>
+      </w:pPr>
+      <w:r>
+        <w:rPr>
+          <w:rFonts w:ascii="Segoe UI Emoji" w:hAnsi="Segoe UI Emoji" w:cs="Segoe UI Emoji"/>
+        </w:rPr>
+        <w:t>✅</w:t>
+      </w:r>
+      <w:r>
+        <w:t xml:space="preserve"> Conditions</w:t>
+      </w:r>
+    </w:p>
+    <w:p>
+      <w:pPr>
+        <w:numPr>
+          <w:ilvl w:val="0"/>
+          <w:numId w:val="1"/>
+        </w:numPr>
+      </w:pPr>
+      <w:r>
+        <w:rPr>
+          <w:rFonts w:ascii="Segoe UI Emoji" w:hAnsi="Segoe UI Emoji" w:cs="Segoe UI Emoji"/>
+        </w:rPr>
+        <w:lastRenderedPageBreak/>
+        <w:t>✅</w:t>
+      </w:r>
+      <w:r>
+        <w:t xml:space="preserve"> Appointments</w:t>
+      </w:r>
+    </w:p>
+    <w:p>
+      <w:pPr>
+        <w:numPr>
+          <w:ilvl w:val="0"/>
+          <w:numId w:val="1"/>
+        </w:numPr>
+      </w:pPr>
+      <w:r>
+        <w:rPr>
+          <w:rFonts w:ascii="Segoe UI Emoji" w:hAnsi="Segoe UI Emoji" w:cs="Segoe UI Emoji"/>
+        </w:rPr>
+        <w:t>✅</w:t>
+      </w:r>
+      <w:r>
+        <w:t xml:space="preserve"> Expenses</w:t>
+      </w:r>
+    </w:p>
+    <w:p>
+      <w:pPr>
+        <w:numPr>
+          <w:ilvl w:val="0"/>
+          <w:numId w:val="1"/>
+        </w:numPr>
+      </w:pPr>
+      <w:r>
+        <w:rPr>
+          <w:rFonts w:ascii="Segoe UI Emoji" w:hAnsi="Segoe UI Emoji" w:cs="Segoe UI Emoji"/>
+        </w:rPr>
+        <w:t>✅</w:t>
+      </w:r>
+      <w:r>
+        <w:t xml:space="preserve"> Medicines</w:t>
+      </w:r>
+    </w:p>
+    <w:p>
+      <w:pPr>
+        <w:numPr>
+          <w:ilvl w:val="0"/>
+          <w:numId w:val="1"/>
+        </w:numPr>
+      </w:pPr>
+      <w:r>
+        <w:rPr>
+          <w:rFonts w:ascii="Segoe UI Emoji" w:hAnsi="Segoe UI Emoji" w:cs="Segoe UI Emoji"/>
+        </w:rPr>
+        <w:t>✅</w:t>
+      </w:r>
+      <w:r>
+        <w:t xml:space="preserve"> Inventory</w:t>
+      </w:r>
+    </w:p>
+    <w:p>
+      <w:pPr>
+        <w:bidi/>
+      </w:pPr>
+      <w:r>
+        <w:rPr>
+          <w:rtl/>
+          <w:lang w:bidi="fa-IR"/>
+        </w:rPr>
+        <w:t xml:space="preserve">چون </w:t>
+      </w:r>
+      <w:proofErr w:type="spellStart"/>
+      <w:r>
+        <w:rPr>
+          <w:rtl/>
+          <w:lang w:bidi="fa-IR"/>
+        </w:rPr>
+        <w:t>این‌ها</w:t>
+      </w:r>
+      <w:proofErr w:type="spellEnd"/>
+      <w:r>
+        <w:rPr>
+          <w:rtl/>
+          <w:lang w:bidi="fa-IR"/>
+        </w:rPr>
+        <w:t xml:space="preserve"> </w:t>
+      </w:r>
+      <w:proofErr w:type="spellStart"/>
+      <w:r>
+        <w:rPr>
+          <w:rtl/>
+          <w:lang w:bidi="fa-IR"/>
+        </w:rPr>
+        <w:t>جدول‌های</w:t>
+      </w:r>
+      <w:proofErr w:type="spellEnd"/>
+      <w:r>
+        <w:rPr>
+          <w:rtl/>
+          <w:lang w:bidi="fa-IR"/>
+        </w:rPr>
+        <w:t xml:space="preserve"> اصلی</w:t>
+      </w:r>
+      <w:r>
+        <w:t xml:space="preserve"> DMS </w:t>
+      </w:r>
+      <w:r>
+        <w:rPr>
+          <w:rtl/>
+          <w:lang w:bidi="fa-IR"/>
+        </w:rPr>
+        <w:t>هستند</w:t>
+      </w:r>
+      <w:r>
+        <w:t>.</w:t>
+      </w:r>
+    </w:p>
+    <w:p>
+      <w:pPr>
+        <w:bidi/>
+      </w:pPr>
+    </w:p>
     <w:sectPr>
       <w:pgSz w:w="12240" w:h="15840"/>
       <w:pgMar w:top="1440" w:right="1440" w:bottom="1440" w:left="1440" w:header="708" w:footer="708" w:gutter="0"/>
@@ -401,6 +3286,127 @@
     </w:sectPr>
   </w:body>
 </w:document>
+</file>
+
+<file path=word/numbering.xml><?xml version="1.0" encoding="utf-8"?>
+<w:numbering xmlns:wpc="http://schemas.microsoft.com/office/word/2010/wordprocessingCanvas" xmlns:cx="http://schemas.microsoft.com/office/drawing/2014/chartex" xmlns:cx1="http://schemas.microsoft.com/office/drawing/2015/9/8/chartex" xmlns:cx2="http://schemas.microsoft.com/office/drawing/2015/10/21/chartex" xmlns:cx3="http://schemas.microsoft.com/office/drawing/2016/5/9/chartex" xmlns:cx4="http://schemas.microsoft.com/office/drawing/2016/5/10/chartex" xmlns:cx5="http://schemas.microsoft.com/office/drawing/2016/5/11/chartex" xmlns:cx6="http://schemas.microsoft.com/office/drawing/2016/5/12/chartex" xmlns:cx7="http://schemas.microsoft.com/office/drawing/2016/5/13/chartex" xmlns:cx8="http://schemas.microsoft.com/office/drawing/2016/5/14/chartex" xmlns:mc="http://schemas.openxmlformats.org/markup-compatibility/2006" xmlns:aink="http://schemas.microsoft.com/office/drawing/2016/ink" xmlns:am3d="http://schemas.microsoft.com/office/drawing/2017/model3d" xmlns:o="urn:schemas-microsoft-com:office:office" xmlns:oel="http://schemas.microsoft.com/office/2019/extlst" xmlns:r="http://schemas.openxmlformats.org/officeDocument/2006/relationships" xmlns:m="http://schemas.openxmlformats.org/officeDocument/2006/math" xmlns:v="urn:schemas-microsoft-com:vml" xmlns:wp14="http://schemas.microsoft.com/office/word/2010/wordprocessingDrawing" xmlns:wp="http://schemas.openxmlformats.org/drawingml/2006/wordprocessingDrawing" xmlns:w10="urn:schemas-microsoft-com:office:word" xmlns:w="http://schemas.openxmlformats.org/wordprocessingml/2006/main" xmlns:w14="http://schemas.microsoft.com/office/word/2010/wordml" xmlns:w15="http://schemas.microsoft.com/office/word/2012/wordml" xmlns:w16cex="http://schemas.microsoft.com/office/word/2018/wordml/cex" xmlns:w16cid="http://schemas.microsoft.com/office/word/2016/wordml/cid" xmlns:w16="http://schemas.microsoft.com/office/word/2018/wordml" xmlns:w16du="http://schemas.microsoft.com/office/word/2023/wordml/word16du" xmlns:w16sdtdh="http://schemas.microsoft.com/office/word/2020/wordml/sdtdatahash" xmlns:w16sdtfl="http://schemas.microsoft.com/office/word/2024/wordml/sdtformatlock" xmlns:w16se="http://schemas.microsoft.com/office/word/2015/wordml/symex" xmlns:wpg="http://schemas.microsoft.com/office/word/2010/wordprocessingGroup" xmlns:wpi="http://schemas.microsoft.com/office/word/2010/wordprocessingInk" xmlns:wne="http://schemas.microsoft.com/office/word/2006/wordml" xmlns:wps="http://schemas.microsoft.com/office/word/2010/wordprocessingShape" mc:Ignorable="w14 w15 w16se w16cid w16 w16cex w16sdtdh w16sdtfl w16du wp14">
+  <w:abstractNum w:abstractNumId="0" w15:restartNumberingAfterBreak="0">
+    <w:nsid w:val="561C2DD1"/>
+    <w:multiLevelType w:val="multilevel"/>
+    <w:tmpl w:val="BBA42234"/>
+    <w:lvl w:ilvl="0">
+      <w:start w:val="1"/>
+      <w:numFmt w:val="decimal"/>
+      <w:lvlText w:val="%1."/>
+      <w:lvlJc w:val="left"/>
+      <w:pPr>
+        <w:tabs>
+          <w:tab w:val="num" w:pos="720"/>
+        </w:tabs>
+        <w:ind w:left="720" w:hanging="360"/>
+      </w:pPr>
+    </w:lvl>
+    <w:lvl w:ilvl="1" w:tentative="1">
+      <w:start w:val="1"/>
+      <w:numFmt w:val="decimal"/>
+      <w:lvlText w:val="%2."/>
+      <w:lvlJc w:val="left"/>
+      <w:pPr>
+        <w:tabs>
+          <w:tab w:val="num" w:pos="1440"/>
+        </w:tabs>
+        <w:ind w:left="1440" w:hanging="360"/>
+      </w:pPr>
+    </w:lvl>
+    <w:lvl w:ilvl="2" w:tentative="1">
+      <w:start w:val="1"/>
+      <w:numFmt w:val="decimal"/>
+      <w:lvlText w:val="%3."/>
+      <w:lvlJc w:val="left"/>
+      <w:pPr>
+        <w:tabs>
+          <w:tab w:val="num" w:pos="2160"/>
+        </w:tabs>
+        <w:ind w:left="2160" w:hanging="360"/>
+      </w:pPr>
+    </w:lvl>
+    <w:lvl w:ilvl="3" w:tentative="1">
+      <w:start w:val="1"/>
+      <w:numFmt w:val="decimal"/>
+      <w:lvlText w:val="%4."/>
+      <w:lvlJc w:val="left"/>
+      <w:pPr>
+        <w:tabs>
+          <w:tab w:val="num" w:pos="2880"/>
+        </w:tabs>
+        <w:ind w:left="2880" w:hanging="360"/>
+      </w:pPr>
+    </w:lvl>
+    <w:lvl w:ilvl="4" w:tentative="1">
+      <w:start w:val="1"/>
+      <w:numFmt w:val="decimal"/>
+      <w:lvlText w:val="%5."/>
+      <w:lvlJc w:val="left"/>
+      <w:pPr>
+        <w:tabs>
+          <w:tab w:val="num" w:pos="3600"/>
+        </w:tabs>
+        <w:ind w:left="3600" w:hanging="360"/>
+      </w:pPr>
+    </w:lvl>
+    <w:lvl w:ilvl="5" w:tentative="1">
+      <w:start w:val="1"/>
+      <w:numFmt w:val="decimal"/>
+      <w:lvlText w:val="%6."/>
+      <w:lvlJc w:val="left"/>
+      <w:pPr>
+        <w:tabs>
+          <w:tab w:val="num" w:pos="4320"/>
+        </w:tabs>
+        <w:ind w:left="4320" w:hanging="360"/>
+      </w:pPr>
+    </w:lvl>
+    <w:lvl w:ilvl="6" w:tentative="1">
+      <w:start w:val="1"/>
+      <w:numFmt w:val="decimal"/>
+      <w:lvlText w:val="%7."/>
+      <w:lvlJc w:val="left"/>
+      <w:pPr>
+        <w:tabs>
+          <w:tab w:val="num" w:pos="5040"/>
+        </w:tabs>
+        <w:ind w:left="5040" w:hanging="360"/>
+      </w:pPr>
+    </w:lvl>
+    <w:lvl w:ilvl="7" w:tentative="1">
+      <w:start w:val="1"/>
+      <w:numFmt w:val="decimal"/>
+      <w:lvlText w:val="%8."/>
+      <w:lvlJc w:val="left"/>
+      <w:pPr>
+        <w:tabs>
+          <w:tab w:val="num" w:pos="5760"/>
+        </w:tabs>
+        <w:ind w:left="5760" w:hanging="360"/>
+      </w:pPr>
+    </w:lvl>
+    <w:lvl w:ilvl="8" w:tentative="1">
+      <w:start w:val="1"/>
+      <w:numFmt w:val="decimal"/>
+      <w:lvlText w:val="%9."/>
+      <w:lvlJc w:val="left"/>
+      <w:pPr>
+        <w:tabs>
+          <w:tab w:val="num" w:pos="6480"/>
+        </w:tabs>
+        <w:ind w:left="6480" w:hanging="360"/>
+      </w:pPr>
+    </w:lvl>
+  </w:abstractNum>
+  <w:num w:numId="1" w16cid:durableId="1174228786">
+    <w:abstractNumId w:val="0"/>
+  </w:num>
+</w:numbering>
 </file>
 
 <file path=word/styles.xml><?xml version="1.0" encoding="utf-8"?>
@@ -1320,6 +4326,302 @@
       <w:spacing w:val="5"/>
     </w:rPr>
   </w:style>
+  <w:style w:type="table" w:styleId="GridTable5Dark-Accent1">
+    <w:name w:val="Grid Table 5 Dark Accent 1"/>
+    <w:basedOn w:val="TableNormal"/>
+    <w:uiPriority w:val="50"/>
+    <w:rsid w:val="00FF07BB"/>
+    <w:pPr>
+      <w:spacing w:after="0" w:line="240" w:lineRule="auto"/>
+    </w:pPr>
+    <w:tblPr>
+      <w:tblStyleRowBandSize w:val="1"/>
+      <w:tblStyleColBandSize w:val="1"/>
+      <w:tblBorders>
+        <w:top w:val="single" w:sz="4" w:space="0" w:color="FFFFFF" w:themeColor="background1"/>
+        <w:left w:val="single" w:sz="4" w:space="0" w:color="FFFFFF" w:themeColor="background1"/>
+        <w:bottom w:val="single" w:sz="4" w:space="0" w:color="FFFFFF" w:themeColor="background1"/>
+        <w:right w:val="single" w:sz="4" w:space="0" w:color="FFFFFF" w:themeColor="background1"/>
+        <w:insideH w:val="single" w:sz="4" w:space="0" w:color="FFFFFF" w:themeColor="background1"/>
+        <w:insideV w:val="single" w:sz="4" w:space="0" w:color="FFFFFF" w:themeColor="background1"/>
+      </w:tblBorders>
+    </w:tblPr>
+    <w:tcPr>
+      <w:shd w:val="clear" w:color="auto" w:fill="C1E4F5" w:themeFill="accent1" w:themeFillTint="33"/>
+    </w:tcPr>
+    <w:tblStylePr w:type="firstRow">
+      <w:rPr>
+        <w:b/>
+        <w:bCs/>
+        <w:color w:val="FFFFFF" w:themeColor="background1"/>
+      </w:rPr>
+      <w:tblPr/>
+      <w:tcPr>
+        <w:tcBorders>
+          <w:top w:val="single" w:sz="4" w:space="0" w:color="FFFFFF" w:themeColor="background1"/>
+          <w:left w:val="single" w:sz="4" w:space="0" w:color="FFFFFF" w:themeColor="background1"/>
+          <w:right w:val="single" w:sz="4" w:space="0" w:color="FFFFFF" w:themeColor="background1"/>
+          <w:insideH w:val="nil"/>
+          <w:insideV w:val="nil"/>
+        </w:tcBorders>
+        <w:shd w:val="clear" w:color="auto" w:fill="156082" w:themeFill="accent1"/>
+      </w:tcPr>
+    </w:tblStylePr>
+    <w:tblStylePr w:type="lastRow">
+      <w:rPr>
+        <w:b/>
+        <w:bCs/>
+        <w:color w:val="FFFFFF" w:themeColor="background1"/>
+      </w:rPr>
+      <w:tblPr/>
+      <w:tcPr>
+        <w:tcBorders>
+          <w:left w:val="single" w:sz="4" w:space="0" w:color="FFFFFF" w:themeColor="background1"/>
+          <w:bottom w:val="single" w:sz="4" w:space="0" w:color="FFFFFF" w:themeColor="background1"/>
+          <w:right w:val="single" w:sz="4" w:space="0" w:color="FFFFFF" w:themeColor="background1"/>
+          <w:insideH w:val="nil"/>
+          <w:insideV w:val="nil"/>
+        </w:tcBorders>
+        <w:shd w:val="clear" w:color="auto" w:fill="156082" w:themeFill="accent1"/>
+      </w:tcPr>
+    </w:tblStylePr>
+    <w:tblStylePr w:type="firstCol">
+      <w:rPr>
+        <w:b/>
+        <w:bCs/>
+        <w:color w:val="FFFFFF" w:themeColor="background1"/>
+      </w:rPr>
+      <w:tblPr/>
+      <w:tcPr>
+        <w:tcBorders>
+          <w:top w:val="single" w:sz="4" w:space="0" w:color="FFFFFF" w:themeColor="background1"/>
+          <w:left w:val="single" w:sz="4" w:space="0" w:color="FFFFFF" w:themeColor="background1"/>
+          <w:bottom w:val="single" w:sz="4" w:space="0" w:color="FFFFFF" w:themeColor="background1"/>
+          <w:insideV w:val="nil"/>
+        </w:tcBorders>
+        <w:shd w:val="clear" w:color="auto" w:fill="156082" w:themeFill="accent1"/>
+      </w:tcPr>
+    </w:tblStylePr>
+    <w:tblStylePr w:type="lastCol">
+      <w:rPr>
+        <w:b/>
+        <w:bCs/>
+        <w:color w:val="FFFFFF" w:themeColor="background1"/>
+      </w:rPr>
+      <w:tblPr/>
+      <w:tcPr>
+        <w:tcBorders>
+          <w:top w:val="single" w:sz="4" w:space="0" w:color="FFFFFF" w:themeColor="background1"/>
+          <w:bottom w:val="single" w:sz="4" w:space="0" w:color="FFFFFF" w:themeColor="background1"/>
+          <w:right w:val="single" w:sz="4" w:space="0" w:color="FFFFFF" w:themeColor="background1"/>
+          <w:insideV w:val="nil"/>
+        </w:tcBorders>
+        <w:shd w:val="clear" w:color="auto" w:fill="156082" w:themeFill="accent1"/>
+      </w:tcPr>
+    </w:tblStylePr>
+    <w:tblStylePr w:type="band1Vert">
+      <w:tblPr/>
+      <w:tcPr>
+        <w:shd w:val="clear" w:color="auto" w:fill="83CAEB" w:themeFill="accent1" w:themeFillTint="66"/>
+      </w:tcPr>
+    </w:tblStylePr>
+    <w:tblStylePr w:type="band1Horz">
+      <w:tblPr/>
+      <w:tcPr>
+        <w:shd w:val="clear" w:color="auto" w:fill="83CAEB" w:themeFill="accent1" w:themeFillTint="66"/>
+      </w:tcPr>
+    </w:tblStylePr>
+  </w:style>
+  <w:style w:type="table" w:styleId="GridTable1Light-Accent1">
+    <w:name w:val="Grid Table 1 Light Accent 1"/>
+    <w:basedOn w:val="TableNormal"/>
+    <w:uiPriority w:val="46"/>
+    <w:rsid w:val="00FF07BB"/>
+    <w:pPr>
+      <w:spacing w:after="0" w:line="240" w:lineRule="auto"/>
+    </w:pPr>
+    <w:tblPr>
+      <w:tblStyleRowBandSize w:val="1"/>
+      <w:tblStyleColBandSize w:val="1"/>
+      <w:tblBorders>
+        <w:top w:val="single" w:sz="4" w:space="0" w:color="83CAEB" w:themeColor="accent1" w:themeTint="66"/>
+        <w:left w:val="single" w:sz="4" w:space="0" w:color="83CAEB" w:themeColor="accent1" w:themeTint="66"/>
+        <w:bottom w:val="single" w:sz="4" w:space="0" w:color="83CAEB" w:themeColor="accent1" w:themeTint="66"/>
+        <w:right w:val="single" w:sz="4" w:space="0" w:color="83CAEB" w:themeColor="accent1" w:themeTint="66"/>
+        <w:insideH w:val="single" w:sz="4" w:space="0" w:color="83CAEB" w:themeColor="accent1" w:themeTint="66"/>
+        <w:insideV w:val="single" w:sz="4" w:space="0" w:color="83CAEB" w:themeColor="accent1" w:themeTint="66"/>
+      </w:tblBorders>
+    </w:tblPr>
+    <w:tblStylePr w:type="firstRow">
+      <w:rPr>
+        <w:b/>
+        <w:bCs/>
+      </w:rPr>
+      <w:tblPr/>
+      <w:tcPr>
+        <w:tcBorders>
+          <w:bottom w:val="single" w:sz="12" w:space="0" w:color="45B0E1" w:themeColor="accent1" w:themeTint="99"/>
+        </w:tcBorders>
+      </w:tcPr>
+    </w:tblStylePr>
+    <w:tblStylePr w:type="lastRow">
+      <w:rPr>
+        <w:b/>
+        <w:bCs/>
+      </w:rPr>
+      <w:tblPr/>
+      <w:tcPr>
+        <w:tcBorders>
+          <w:top w:val="double" w:sz="2" w:space="0" w:color="45B0E1" w:themeColor="accent1" w:themeTint="99"/>
+        </w:tcBorders>
+      </w:tcPr>
+    </w:tblStylePr>
+    <w:tblStylePr w:type="firstCol">
+      <w:rPr>
+        <w:b/>
+        <w:bCs/>
+      </w:rPr>
+    </w:tblStylePr>
+    <w:tblStylePr w:type="lastCol">
+      <w:rPr>
+        <w:b/>
+        <w:bCs/>
+      </w:rPr>
+    </w:tblStylePr>
+  </w:style>
+  <w:style w:type="table" w:styleId="GridTable1Light">
+    <w:name w:val="Grid Table 1 Light"/>
+    <w:basedOn w:val="TableNormal"/>
+    <w:uiPriority w:val="46"/>
+    <w:rsid w:val="00FF07BB"/>
+    <w:pPr>
+      <w:spacing w:after="0" w:line="240" w:lineRule="auto"/>
+    </w:pPr>
+    <w:tblPr>
+      <w:tblStyleRowBandSize w:val="1"/>
+      <w:tblStyleColBandSize w:val="1"/>
+      <w:tblBorders>
+        <w:top w:val="single" w:sz="4" w:space="0" w:color="999999" w:themeColor="text1" w:themeTint="66"/>
+        <w:left w:val="single" w:sz="4" w:space="0" w:color="999999" w:themeColor="text1" w:themeTint="66"/>
+        <w:bottom w:val="single" w:sz="4" w:space="0" w:color="999999" w:themeColor="text1" w:themeTint="66"/>
+        <w:right w:val="single" w:sz="4" w:space="0" w:color="999999" w:themeColor="text1" w:themeTint="66"/>
+        <w:insideH w:val="single" w:sz="4" w:space="0" w:color="999999" w:themeColor="text1" w:themeTint="66"/>
+        <w:insideV w:val="single" w:sz="4" w:space="0" w:color="999999" w:themeColor="text1" w:themeTint="66"/>
+      </w:tblBorders>
+    </w:tblPr>
+    <w:tblStylePr w:type="firstRow">
+      <w:rPr>
+        <w:b/>
+        <w:bCs/>
+      </w:rPr>
+      <w:tblPr/>
+      <w:tcPr>
+        <w:tcBorders>
+          <w:bottom w:val="single" w:sz="12" w:space="0" w:color="666666" w:themeColor="text1" w:themeTint="99"/>
+        </w:tcBorders>
+      </w:tcPr>
+    </w:tblStylePr>
+    <w:tblStylePr w:type="lastRow">
+      <w:rPr>
+        <w:b/>
+        <w:bCs/>
+      </w:rPr>
+      <w:tblPr/>
+      <w:tcPr>
+        <w:tcBorders>
+          <w:top w:val="double" w:sz="2" w:space="0" w:color="666666" w:themeColor="text1" w:themeTint="99"/>
+        </w:tcBorders>
+      </w:tcPr>
+    </w:tblStylePr>
+    <w:tblStylePr w:type="firstCol">
+      <w:rPr>
+        <w:b/>
+        <w:bCs/>
+      </w:rPr>
+    </w:tblStylePr>
+    <w:tblStylePr w:type="lastCol">
+      <w:rPr>
+        <w:b/>
+        <w:bCs/>
+      </w:rPr>
+    </w:tblStylePr>
+  </w:style>
+  <w:style w:type="table" w:styleId="GridTable4-Accent2">
+    <w:name w:val="Grid Table 4 Accent 2"/>
+    <w:basedOn w:val="TableNormal"/>
+    <w:uiPriority w:val="49"/>
+    <w:rsid w:val="00FF07BB"/>
+    <w:pPr>
+      <w:spacing w:after="0" w:line="240" w:lineRule="auto"/>
+    </w:pPr>
+    <w:tblPr>
+      <w:tblStyleRowBandSize w:val="1"/>
+      <w:tblStyleColBandSize w:val="1"/>
+      <w:tblBorders>
+        <w:top w:val="single" w:sz="4" w:space="0" w:color="F1A983" w:themeColor="accent2" w:themeTint="99"/>
+        <w:left w:val="single" w:sz="4" w:space="0" w:color="F1A983" w:themeColor="accent2" w:themeTint="99"/>
+        <w:bottom w:val="single" w:sz="4" w:space="0" w:color="F1A983" w:themeColor="accent2" w:themeTint="99"/>
+        <w:right w:val="single" w:sz="4" w:space="0" w:color="F1A983" w:themeColor="accent2" w:themeTint="99"/>
+        <w:insideH w:val="single" w:sz="4" w:space="0" w:color="F1A983" w:themeColor="accent2" w:themeTint="99"/>
+        <w:insideV w:val="single" w:sz="4" w:space="0" w:color="F1A983" w:themeColor="accent2" w:themeTint="99"/>
+      </w:tblBorders>
+    </w:tblPr>
+    <w:tblStylePr w:type="firstRow">
+      <w:rPr>
+        <w:b/>
+        <w:bCs/>
+        <w:color w:val="FFFFFF" w:themeColor="background1"/>
+      </w:rPr>
+      <w:tblPr/>
+      <w:tcPr>
+        <w:tcBorders>
+          <w:top w:val="single" w:sz="4" w:space="0" w:color="E97132" w:themeColor="accent2"/>
+          <w:left w:val="single" w:sz="4" w:space="0" w:color="E97132" w:themeColor="accent2"/>
+          <w:bottom w:val="single" w:sz="4" w:space="0" w:color="E97132" w:themeColor="accent2"/>
+          <w:right w:val="single" w:sz="4" w:space="0" w:color="E97132" w:themeColor="accent2"/>
+          <w:insideH w:val="nil"/>
+          <w:insideV w:val="nil"/>
+        </w:tcBorders>
+        <w:shd w:val="clear" w:color="auto" w:fill="E97132" w:themeFill="accent2"/>
+      </w:tcPr>
+    </w:tblStylePr>
+    <w:tblStylePr w:type="lastRow">
+      <w:rPr>
+        <w:b/>
+        <w:bCs/>
+      </w:rPr>
+      <w:tblPr/>
+      <w:tcPr>
+        <w:tcBorders>
+          <w:top w:val="double" w:sz="4" w:space="0" w:color="E97132" w:themeColor="accent2"/>
+        </w:tcBorders>
+      </w:tcPr>
+    </w:tblStylePr>
+    <w:tblStylePr w:type="firstCol">
+      <w:rPr>
+        <w:b/>
+        <w:bCs/>
+      </w:rPr>
+    </w:tblStylePr>
+    <w:tblStylePr w:type="lastCol">
+      <w:rPr>
+        <w:b/>
+        <w:bCs/>
+      </w:rPr>
+    </w:tblStylePr>
+    <w:tblStylePr w:type="band1Vert">
+      <w:tblPr/>
+      <w:tcPr>
+        <w:shd w:val="clear" w:color="auto" w:fill="FAE2D5" w:themeFill="accent2" w:themeFillTint="33"/>
+      </w:tcPr>
+    </w:tblStylePr>
+    <w:tblStylePr w:type="band1Horz">
+      <w:tblPr/>
+      <w:tcPr>
+        <w:shd w:val="clear" w:color="auto" w:fill="FAE2D5" w:themeFill="accent2" w:themeFillTint="33"/>
+      </w:tcPr>
+    </w:tblStylePr>
+  </w:style>
 </w:styles>
 </file>
 

</xml_diff>